<commit_message>
asking admin before deleting or changing his user role + project documentation
</commit_message>
<xml_diff>
--- a/project-documentation/dokumentace.docx
+++ b/project-documentation/dokumentace.docx
@@ -2283,13 +2283,27 @@
         <w:ind w:firstLine="708"/>
       </w:pPr>
       <w:r>
-        <w:t xml:space="preserve">Tato práce představuje vývoj aplikace v jazyce Java, </w:t>
+        <w:t xml:space="preserve">Tato práce představuje vývoj aplikace v jazyce </w:t>
+      </w:r>
+      <w:r>
+        <w:rPr>
+          <w:i/>
+          <w:iCs/>
+        </w:rPr>
+        <w:t>Java</w:t>
+      </w:r>
+      <w:r>
+        <w:t xml:space="preserve">, </w:t>
       </w:r>
       <w:r>
         <w:t xml:space="preserve">s uživatelským rozhraním vytvořeným pomocí </w:t>
       </w:r>
       <w:proofErr w:type="spellStart"/>
       <w:r>
+        <w:rPr>
+          <w:i/>
+          <w:iCs/>
+        </w:rPr>
         <w:t>JavaFX</w:t>
       </w:r>
       <w:proofErr w:type="spellEnd"/>
@@ -3406,12 +3420,28 @@
         <w:rPr>
           <w:rFonts w:eastAsiaTheme="majorEastAsia"/>
         </w:rPr>
-        <w:t xml:space="preserve"> usnadní tvorbu a správu testů pro studenty středních škol. Aplikace, implementovaná v jazyce Java s uživatelským rozhraním postaveným na </w:t>
+        <w:t xml:space="preserve"> usnadní tvorbu a správu testů pro studenty středních škol. Aplikace, implementovaná v jazyce </w:t>
+      </w:r>
+      <w:r>
+        <w:rPr>
+          <w:rFonts w:eastAsiaTheme="majorEastAsia"/>
+          <w:i/>
+          <w:iCs/>
+        </w:rPr>
+        <w:t>Java</w:t>
+      </w:r>
+      <w:r>
+        <w:rPr>
+          <w:rFonts w:eastAsiaTheme="majorEastAsia"/>
+        </w:rPr>
+        <w:t xml:space="preserve"> s uživatelským rozhraním postaveným na </w:t>
       </w:r>
       <w:proofErr w:type="spellStart"/>
       <w:r>
         <w:rPr>
           <w:rFonts w:eastAsiaTheme="majorEastAsia"/>
+          <w:i/>
+          <w:iCs/>
         </w:rPr>
         <w:t>JavaFX</w:t>
       </w:r>
@@ -3502,6 +3532,8 @@
       <w:r>
         <w:rPr>
           <w:rFonts w:eastAsiaTheme="majorEastAsia"/>
+          <w:i/>
+          <w:iCs/>
         </w:rPr>
         <w:t>ChatGPT</w:t>
       </w:r>
@@ -3516,6 +3548,8 @@
       <w:r>
         <w:rPr>
           <w:rFonts w:eastAsiaTheme="majorEastAsia"/>
+          <w:i/>
+          <w:iCs/>
         </w:rPr>
         <w:t>Gemini</w:t>
       </w:r>
@@ -3548,7 +3582,13 @@
         <w:rPr>
           <w:rFonts w:eastAsiaTheme="majorEastAsia"/>
         </w:rPr>
-        <w:t>Prvním zásadním rozdílem je automatizované generování a okamžitá tvorba dokumentu ve formátu *.</w:t>
+        <w:t xml:space="preserve">Prvním zásadním rozdílem je automatizované generování a okamžitá tvorba dokumentu ve formátu </w:t>
+      </w:r>
+      <w:r>
+        <w:rPr>
+          <w:rFonts w:eastAsiaTheme="majorEastAsia"/>
+        </w:rPr>
+        <w:t>*.</w:t>
       </w:r>
       <w:proofErr w:type="spellStart"/>
       <w:r>
@@ -3562,7 +3602,21 @@
         <w:rPr>
           <w:rFonts w:eastAsiaTheme="majorEastAsia"/>
         </w:rPr>
-        <w:t xml:space="preserve"> – funkce, kterou nelze dosáhnout pomocí běžných volně přístupných AI systémů. </w:t>
+        <w:t xml:space="preserve"> – funkce, kterou nelze dosáhnout pomocí běžných volně přístupných </w:t>
+      </w:r>
+      <w:r>
+        <w:rPr>
+          <w:rFonts w:eastAsiaTheme="majorEastAsia"/>
+          <w:i/>
+          <w:iCs/>
+        </w:rPr>
+        <w:t>AI</w:t>
+      </w:r>
+      <w:r>
+        <w:rPr>
+          <w:rFonts w:eastAsiaTheme="majorEastAsia"/>
+        </w:rPr>
+        <w:t xml:space="preserve"> systémů. </w:t>
       </w:r>
     </w:p>
     <w:p>
@@ -3582,6 +3636,8 @@
       <w:r>
         <w:rPr>
           <w:rFonts w:eastAsiaTheme="majorEastAsia"/>
+          <w:i/>
+          <w:iCs/>
         </w:rPr>
         <w:t>Promptování</w:t>
       </w:r>
@@ -3646,7 +3702,49 @@
         <w:rPr>
           <w:rFonts w:eastAsiaTheme="majorEastAsia"/>
         </w:rPr>
-        <w:t>Třetím významným rozdílem je implementovaná validace výstupních dat. I u rozsáhlého a přesně definovaného promptu není zaručeno, že AI na první pokus vygeneruje test ve správném formátu. Aplikace proto obsahuje validační metody, které umožňují opakované předání výsledku umělé inteligenci s konkrétními instrukcemi k úpravám, dokud výsledný dokument nevyhoví stanoveným kritériím. Je třeba zmínit, že v některých případech může dojít k tzv. AI halucinaci, kdy umělá inteligence začne generovat nesouvisející nebo chybné informace</w:t>
+        <w:t xml:space="preserve">Třetím významným rozdílem je implementovaná validace výstupních dat. I u rozsáhlého a přesně definovaného promptu není zaručeno, že </w:t>
+      </w:r>
+      <w:r>
+        <w:rPr>
+          <w:rFonts w:eastAsiaTheme="majorEastAsia"/>
+          <w:i/>
+          <w:iCs/>
+        </w:rPr>
+        <w:t>AI</w:t>
+      </w:r>
+      <w:r>
+        <w:rPr>
+          <w:rFonts w:eastAsiaTheme="majorEastAsia"/>
+        </w:rPr>
+        <w:t xml:space="preserve"> na první pokus vygeneruje test ve správném formátu. Aplikace proto obsahuje validační metody, které umožňují opakované předání výsledku umělé inteligenci s konkrétními instrukcemi k úpravám, dokud výsledný dokument nevyhoví stanoveným kritériím. Je třeba zmínit, že v některých případech může dojít k tzv. </w:t>
+      </w:r>
+      <w:r>
+        <w:rPr>
+          <w:rFonts w:eastAsiaTheme="majorEastAsia"/>
+          <w:i/>
+          <w:iCs/>
+        </w:rPr>
+        <w:t>AI</w:t>
+      </w:r>
+      <w:r>
+        <w:rPr>
+          <w:rFonts w:eastAsiaTheme="majorEastAsia"/>
+        </w:rPr>
+        <w:t xml:space="preserve"> </w:t>
+      </w:r>
+      <w:r>
+        <w:rPr>
+          <w:rFonts w:eastAsiaTheme="majorEastAsia"/>
+          <w:i/>
+          <w:iCs/>
+        </w:rPr>
+        <w:t>halucinaci</w:t>
+      </w:r>
+      <w:r>
+        <w:rPr>
+          <w:rFonts w:eastAsiaTheme="majorEastAsia"/>
+        </w:rPr>
+        <w:t>, kdy umělá inteligence začne generovat nesouvisející nebo chybné informace</w:t>
       </w:r>
       <w:r>
         <w:rPr>
@@ -3658,12 +3756,28 @@
         <w:rPr>
           <w:rFonts w:eastAsiaTheme="majorEastAsia"/>
         </w:rPr>
-        <w:t xml:space="preserve">. V takové situaci obvykle není možné AI navést ke správnému výsledku během probíhajícího chatu a je třeba zahájit novou komunikaci. Moje aplikace tento jev detekuje, informuje uživatele o vzniklé situaci a vyzve ho k opětovnému vygenerování testu. Na pozadí aplikačního řešení se tak odehrává složitý proces </w:t>
+        <w:t xml:space="preserve">. V takové situaci obvykle není možné </w:t>
+      </w:r>
+      <w:r>
+        <w:rPr>
+          <w:rFonts w:eastAsiaTheme="majorEastAsia"/>
+          <w:i/>
+          <w:iCs/>
+        </w:rPr>
+        <w:t>AI</w:t>
+      </w:r>
+      <w:r>
+        <w:rPr>
+          <w:rFonts w:eastAsiaTheme="majorEastAsia"/>
+        </w:rPr>
+        <w:t xml:space="preserve"> navést ke správnému výsledku během probíhajícího chatu a je třeba zahájit novou komunikaci. Moje aplikace tento jev detekuje, informuje uživatele o vzniklé situaci a vyzve ho k opětovnému vygenerování testu. Na pozadí aplikačního řešení se tak odehrává složitý proces </w:t>
       </w:r>
       <w:proofErr w:type="spellStart"/>
       <w:r>
         <w:rPr>
           <w:rFonts w:eastAsiaTheme="majorEastAsia"/>
+          <w:i/>
+          <w:iCs/>
         </w:rPr>
         <w:t>promptování</w:t>
       </w:r>
@@ -3797,14 +3911,27 @@
                             <w:r>
                               <w:t xml:space="preserve">Obrázek </w:t>
                             </w:r>
-                            <w:fldSimple w:instr=" SEQ Obrázek \* ARABIC ">
-                              <w:r>
-                                <w:rPr>
-                                  <w:noProof/>
-                                </w:rPr>
-                                <w:t>1</w:t>
-                              </w:r>
-                            </w:fldSimple>
+                            <w:r>
+                              <w:fldChar w:fldCharType="begin"/>
+                            </w:r>
+                            <w:r>
+                              <w:instrText xml:space="preserve"> SEQ Obrázek \* ARABIC </w:instrText>
+                            </w:r>
+                            <w:r>
+                              <w:fldChar w:fldCharType="separate"/>
+                            </w:r>
+                            <w:r>
+                              <w:rPr>
+                                <w:noProof/>
+                              </w:rPr>
+                              <w:t>1</w:t>
+                            </w:r>
+                            <w:r>
+                              <w:rPr>
+                                <w:noProof/>
+                              </w:rPr>
+                              <w:fldChar w:fldCharType="end"/>
+                            </w:r>
                             <w:r>
                               <w:t xml:space="preserve">: </w:t>
                             </w:r>
@@ -3845,14 +3972,27 @@
                       <w:r>
                         <w:t xml:space="preserve">Obrázek </w:t>
                       </w:r>
-                      <w:fldSimple w:instr=" SEQ Obrázek \* ARABIC ">
-                        <w:r>
-                          <w:rPr>
-                            <w:noProof/>
-                          </w:rPr>
-                          <w:t>1</w:t>
-                        </w:r>
-                      </w:fldSimple>
+                      <w:r>
+                        <w:fldChar w:fldCharType="begin"/>
+                      </w:r>
+                      <w:r>
+                        <w:instrText xml:space="preserve"> SEQ Obrázek \* ARABIC </w:instrText>
+                      </w:r>
+                      <w:r>
+                        <w:fldChar w:fldCharType="separate"/>
+                      </w:r>
+                      <w:r>
+                        <w:rPr>
+                          <w:noProof/>
+                        </w:rPr>
+                        <w:t>1</w:t>
+                      </w:r>
+                      <w:r>
+                        <w:rPr>
+                          <w:noProof/>
+                        </w:rPr>
+                        <w:fldChar w:fldCharType="end"/>
+                      </w:r>
                       <w:r>
                         <w:t xml:space="preserve">: </w:t>
                       </w:r>
@@ -3967,7 +4107,21 @@
         <w:rPr>
           <w:rFonts w:eastAsiaTheme="majorEastAsia"/>
         </w:rPr>
-        <w:t xml:space="preserve"> mohou v některých případech nastat nepředvídatelné chyby související s AI halucinacemi či jinými odchylkami od očekávaného výstupu. Tyto chyby mohou způsobit, že test nebude vygenerován vůbec, bude vygenerován s mírnými formátovacími nedostatky, nebo může obsahovat faktické chyby či misinformace. </w:t>
+        <w:t xml:space="preserve"> mohou v některých případech nastat nepředvídatelné chyby související s </w:t>
+      </w:r>
+      <w:r>
+        <w:rPr>
+          <w:rFonts w:eastAsiaTheme="majorEastAsia"/>
+          <w:i/>
+          <w:iCs/>
+        </w:rPr>
+        <w:t>AI halucinacemi</w:t>
+      </w:r>
+      <w:r>
+        <w:rPr>
+          <w:rFonts w:eastAsiaTheme="majorEastAsia"/>
+        </w:rPr>
+        <w:t xml:space="preserve"> či jinými odchylkami od očekávaného výstupu. Tyto chyby mohou způsobit, že test nebude vygenerován vůbec, bude vygenerován s mírnými formátovacími nedostatky, nebo může obsahovat faktické chyby či misinformace. </w:t>
       </w:r>
     </w:p>
     <w:p>
@@ -4005,7 +4159,21 @@
         <w:rPr>
           <w:rFonts w:eastAsiaTheme="majorEastAsia"/>
         </w:rPr>
-        <w:t xml:space="preserve">. V případě faktických chyb či misinformací se aplikace rovněž snaží tyto problémy hlídat pomocí AI validace, avšak konečná kontrola správnosti testu je vždy na uživateli. </w:t>
+        <w:t xml:space="preserve">. V případě faktických chyb či misinformací se aplikace rovněž snaží tyto problémy hlídat pomocí </w:t>
+      </w:r>
+      <w:r>
+        <w:rPr>
+          <w:rFonts w:eastAsiaTheme="majorEastAsia"/>
+          <w:i/>
+          <w:iCs/>
+        </w:rPr>
+        <w:t>AI</w:t>
+      </w:r>
+      <w:r>
+        <w:rPr>
+          <w:rFonts w:eastAsiaTheme="majorEastAsia"/>
+        </w:rPr>
+        <w:t xml:space="preserve"> validace, avšak konečná kontrola správnosti testu je vždy na uživateli. </w:t>
       </w:r>
     </w:p>
     <w:p>
@@ -4024,6 +4192,44 @@
           <w:bCs/>
         </w:rPr>
         <w:t>Používáním této aplikace tudíž uživatel bere na vědomí, že výsledný test je nutno pečlivě přezkoumat a ověřit, či je zcela bez chyb.</w:t>
+      </w:r>
+    </w:p>
+    <w:p>
+      <w:pPr>
+        <w:spacing w:before="0" w:after="160" w:line="259" w:lineRule="auto"/>
+        <w:rPr>
+          <w:rFonts w:eastAsiaTheme="majorEastAsia"/>
+        </w:rPr>
+      </w:pPr>
+      <w:r>
+        <w:rPr>
+          <w:rFonts w:eastAsiaTheme="majorEastAsia"/>
+        </w:rPr>
+        <w:br w:type="page"/>
+      </w:r>
+    </w:p>
+    <w:p>
+      <w:pPr>
+        <w:pStyle w:val="Nadpis1"/>
+      </w:pPr>
+      <w:r>
+        <w:lastRenderedPageBreak/>
+        <w:t>Postup tvorby práce</w:t>
+      </w:r>
+    </w:p>
+    <w:p>
+      <w:pPr>
+        <w:rPr>
+          <w:rFonts w:eastAsiaTheme="majorEastAsia"/>
+          <w:color w:val="FF0000"/>
+        </w:rPr>
+      </w:pPr>
+      <w:r>
+        <w:rPr>
+          <w:rFonts w:eastAsiaTheme="majorEastAsia"/>
+          <w:color w:val="FF0000"/>
+        </w:rPr>
+        <w:t>// DOPLNIT</w:t>
       </w:r>
     </w:p>
     <w:p>
@@ -4071,1128 +4277,470 @@
       <w:r>
         <w:rPr>
           <w:rFonts w:eastAsiaTheme="majorEastAsia"/>
-          <w:b/>
-          <w:bCs/>
-        </w:rPr>
-        <w:t>Java</w:t>
-      </w:r>
-      <w:r>
-        <w:rPr>
-          <w:rFonts w:eastAsiaTheme="majorEastAsia"/>
-        </w:rPr>
-        <w:t xml:space="preserve"> </w:t>
-      </w:r>
-      <w:r>
-        <w:rPr>
-          <w:rFonts w:eastAsiaTheme="majorEastAsia"/>
-        </w:rPr>
-        <w:t>je objektově orientovaný programovací jazyk, který se široce využívá pro vývoj aplikací různých typů – desktopových, webových či mobilních.</w:t>
-      </w:r>
-      <w:r>
-        <w:rPr>
-          <w:rFonts w:eastAsiaTheme="majorEastAsia"/>
-        </w:rPr>
-        <w:t xml:space="preserve"> Právě z tohoto důvodu jsem tento jazyk zvolil pro tvorbu aplikace.</w:t>
-      </w:r>
-    </w:p>
-    <w:p>
-      <w:pPr>
-        <w:ind w:firstLine="432"/>
-        <w:rPr>
-          <w:rFonts w:eastAsiaTheme="majorEastAsia"/>
-        </w:rPr>
-      </w:pPr>
-      <w:r>
-        <w:rPr>
-          <w:rFonts w:eastAsiaTheme="majorEastAsia"/>
-          <w:b/>
-          <w:bCs/>
-        </w:rPr>
-        <w:t>JDK</w:t>
-      </w:r>
-      <w:r>
-        <w:rPr>
-          <w:rFonts w:eastAsiaTheme="majorEastAsia"/>
-        </w:rPr>
-        <w:t xml:space="preserve"> (Java Development Kit) je základní balík nástrojů a knihoven, které jsou nezbytné pro vývoj a běh aplikací psaných v jazyce Java. V této aplikaci se využívá JDK verze 21, což představuje jednu z jeho nejnovějších verzí, a nabízí tedy aktuální funkce a optimalizace, které přispívají k efektivnějšímu vývoji a vyššímu výkonu aplikací.</w:t>
-      </w:r>
-    </w:p>
-    <w:p>
-      <w:pPr>
-        <w:pStyle w:val="Nadpis2"/>
-      </w:pPr>
-      <w:bookmarkStart w:id="20" w:name="_Toc191402521"/>
-      <w:r>
-        <w:t>Vývojové prostředí</w:t>
-      </w:r>
-      <w:bookmarkEnd w:id="20"/>
-    </w:p>
-    <w:p>
-      <w:pPr>
-        <w:ind w:firstLine="576"/>
-        <w:rPr>
-          <w:rFonts w:eastAsiaTheme="majorEastAsia"/>
-        </w:rPr>
-      </w:pPr>
-      <w:r>
-        <w:rPr>
-          <w:rFonts w:eastAsiaTheme="majorEastAsia"/>
-          <w:b/>
-          <w:bCs/>
-        </w:rPr>
-        <w:t>IntelliJ IDEA</w:t>
-      </w:r>
-      <w:r>
-        <w:rPr>
-          <w:rFonts w:eastAsiaTheme="majorEastAsia"/>
-        </w:rPr>
-        <w:t xml:space="preserve"> je přední integrované vývojové prostředí (IDE) od společnosti JetBrains, které podporuje řadu programovacích jazyků, se zvláštním důrazem na Javu. Poskytuje</w:t>
-      </w:r>
-      <w:r>
-        <w:rPr>
-          <w:rFonts w:eastAsiaTheme="majorEastAsia"/>
-        </w:rPr>
-        <w:t xml:space="preserve"> například</w:t>
-      </w:r>
-      <w:r>
-        <w:rPr>
-          <w:rFonts w:eastAsiaTheme="majorEastAsia"/>
-        </w:rPr>
-        <w:t xml:space="preserve"> inteligentní asistenci, refa</w:t>
-      </w:r>
-      <w:r>
-        <w:rPr>
-          <w:rFonts w:eastAsiaTheme="majorEastAsia"/>
-        </w:rPr>
-        <w:t>c</w:t>
-      </w:r>
-      <w:r>
-        <w:rPr>
-          <w:rFonts w:eastAsiaTheme="majorEastAsia"/>
-        </w:rPr>
-        <w:t>toring a debugging, což značně urychluje vývoj softwaru.</w:t>
-      </w:r>
-    </w:p>
-    <w:p>
-      <w:pPr>
-        <w:ind w:firstLine="576"/>
-        <w:rPr>
-          <w:rFonts w:eastAsiaTheme="majorEastAsia"/>
-        </w:rPr>
-      </w:pPr>
-      <w:r>
-        <w:rPr>
-          <w:rFonts w:eastAsiaTheme="majorEastAsia"/>
-          <w:b/>
-          <w:bCs/>
-        </w:rPr>
-        <w:t>Scene Builder</w:t>
-      </w:r>
-      <w:r>
-        <w:rPr>
-          <w:rFonts w:eastAsiaTheme="majorEastAsia"/>
-        </w:rPr>
-        <w:t xml:space="preserve"> je vizuální nástroj pro tvorbu a úpravu FXML souborů, které definují grafické rozhraní v aplikacích založených na JavaFX. Umožňuje návrhářům a vývojářům snadno vytvářet uživatelská rozhraní pomocí drag-and-drop prvků.</w:t>
-      </w:r>
-    </w:p>
-    <w:p>
-      <w:pPr>
-        <w:pStyle w:val="Nadpis2"/>
-      </w:pPr>
-      <w:bookmarkStart w:id="21" w:name="_Toc191402522"/>
-      <w:r>
-        <w:t>Buildovací a verzovací nástroje</w:t>
-      </w:r>
-      <w:bookmarkEnd w:id="21"/>
-    </w:p>
-    <w:p>
-      <w:pPr>
-        <w:ind w:firstLine="576"/>
-      </w:pPr>
-      <w:r>
-        <w:rPr>
-          <w:b/>
-          <w:bCs/>
-        </w:rPr>
-        <w:t>Závislost</w:t>
-      </w:r>
-      <w:r>
-        <w:t xml:space="preserve"> (dependency) označuje externí knihovnu nebo balík softwaru, který je nezbytný pro správnou funkci a kompilaci vašeho projektu.</w:t>
-      </w:r>
-    </w:p>
-    <w:p>
-      <w:pPr>
-        <w:ind w:firstLine="576"/>
-        <w:rPr>
-          <w:rFonts w:eastAsiaTheme="majorEastAsia"/>
-        </w:rPr>
-      </w:pPr>
-      <w:r>
-        <w:rPr>
-          <w:rFonts w:eastAsiaTheme="majorEastAsia"/>
-          <w:b/>
-          <w:bCs/>
-        </w:rPr>
-        <w:t>Apache Maven</w:t>
-      </w:r>
-      <w:r>
-        <w:rPr>
-          <w:rFonts w:eastAsiaTheme="majorEastAsia"/>
-        </w:rPr>
-        <w:t xml:space="preserve"> je buildovací a projektový nástroj, který se používá ke správě závislostí</w:t>
-      </w:r>
-      <w:r>
-        <w:rPr>
-          <w:rFonts w:eastAsiaTheme="majorEastAsia"/>
-        </w:rPr>
-        <w:t xml:space="preserve"> (dependencies)</w:t>
-      </w:r>
-      <w:r>
-        <w:rPr>
-          <w:rFonts w:eastAsiaTheme="majorEastAsia"/>
-        </w:rPr>
-        <w:t xml:space="preserve">, kompilaci zdrojového kódu, testování a balení výsledných </w:t>
-      </w:r>
-      <w:r>
-        <w:rPr>
-          <w:rFonts w:eastAsiaTheme="majorEastAsia"/>
-        </w:rPr>
-        <w:t>projektů</w:t>
-      </w:r>
-      <w:r>
-        <w:rPr>
-          <w:rFonts w:eastAsiaTheme="majorEastAsia"/>
-        </w:rPr>
-        <w:t>. V</w:t>
-      </w:r>
-      <w:r>
-        <w:rPr>
-          <w:rFonts w:eastAsiaTheme="majorEastAsia"/>
-        </w:rPr>
-        <w:t xml:space="preserve"> mém </w:t>
-      </w:r>
-      <w:r>
-        <w:rPr>
-          <w:rFonts w:eastAsiaTheme="majorEastAsia"/>
-        </w:rPr>
-        <w:t xml:space="preserve">projektu je využíván soubor </w:t>
-      </w:r>
-      <w:r>
-        <w:rPr>
-          <w:rStyle w:val="KdChar"/>
-        </w:rPr>
-        <w:t>pom.xml</w:t>
-      </w:r>
-      <w:r>
-        <w:rPr>
-          <w:rFonts w:eastAsiaTheme="majorEastAsia"/>
-        </w:rPr>
-        <w:t xml:space="preserve"> k definování závislostí a konfiguraci build procesu.</w:t>
-      </w:r>
-    </w:p>
-    <w:p>
-      <w:pPr>
-        <w:ind w:firstLine="576"/>
-        <w:rPr>
-          <w:rFonts w:eastAsiaTheme="majorEastAsia"/>
-        </w:rPr>
-      </w:pPr>
-      <w:r>
-        <w:rPr>
-          <w:rFonts w:eastAsiaTheme="majorEastAsia"/>
-          <w:b/>
-          <w:bCs/>
-        </w:rPr>
-        <w:t>Git</w:t>
-      </w:r>
-      <w:r>
-        <w:rPr>
-          <w:rFonts w:eastAsiaTheme="majorEastAsia"/>
-        </w:rPr>
-        <w:t xml:space="preserve"> je distribuovaný </w:t>
-      </w:r>
-      <w:proofErr w:type="spellStart"/>
-      <w:r>
-        <w:rPr>
-          <w:rFonts w:eastAsiaTheme="majorEastAsia"/>
-        </w:rPr>
-        <w:t>verzovací</w:t>
-      </w:r>
-      <w:proofErr w:type="spellEnd"/>
-      <w:r>
-        <w:rPr>
-          <w:rFonts w:eastAsiaTheme="majorEastAsia"/>
-        </w:rPr>
-        <w:t xml:space="preserve"> systém, který umožňuje sledovat změny v kódu, spolupracovat v týmech a snadno spravovat různé verze vývoje softwaru. </w:t>
-      </w:r>
-      <w:r>
-        <w:rPr>
-          <w:rFonts w:eastAsiaTheme="majorEastAsia"/>
-        </w:rPr>
-        <w:t>V dnešní době je široce rozšířený a j</w:t>
-      </w:r>
-      <w:r>
-        <w:rPr>
-          <w:rFonts w:eastAsiaTheme="majorEastAsia"/>
-        </w:rPr>
-        <w:t>e nezbytným nástrojem pro správu zdrojových kódů a historii projektu.</w:t>
-      </w:r>
-    </w:p>
-    <w:p>
-      <w:pPr>
-        <w:pStyle w:val="Nadpis2"/>
-      </w:pPr>
-      <w:bookmarkStart w:id="22" w:name="_Toc191402523"/>
-      <w:r>
-        <w:t>Databázový systém</w:t>
-      </w:r>
-      <w:bookmarkEnd w:id="22"/>
-    </w:p>
-    <w:p>
-      <w:pPr>
-        <w:ind w:firstLine="576"/>
-        <w:rPr>
-          <w:rFonts w:eastAsiaTheme="majorEastAsia"/>
-        </w:rPr>
-      </w:pPr>
-      <w:r>
-        <w:rPr>
-          <w:rFonts w:eastAsiaTheme="majorEastAsia"/>
-          <w:b/>
-          <w:bCs/>
-        </w:rPr>
-        <w:t>MySQL</w:t>
-      </w:r>
-      <w:r>
-        <w:rPr>
-          <w:rFonts w:eastAsiaTheme="majorEastAsia"/>
-        </w:rPr>
-        <w:t xml:space="preserve"> je relační databázový systém pro ukládání a správu dat. Je známý svou spolehlivostí, robustností i vysokým výkonem. V aplikaci slouží k uložení a správě dat, jako jsou informace o testech, promptech, uživatelích, </w:t>
-      </w:r>
-      <w:r>
-        <w:rPr>
-          <w:rFonts w:eastAsiaTheme="majorEastAsia"/>
-        </w:rPr>
-        <w:t>předmětech</w:t>
-      </w:r>
-      <w:r>
-        <w:rPr>
-          <w:rFonts w:eastAsiaTheme="majorEastAsia"/>
-        </w:rPr>
-        <w:t xml:space="preserve"> i dalších entitách.</w:t>
-      </w:r>
-      <w:r>
-        <w:rPr>
-          <w:rFonts w:eastAsiaTheme="majorEastAsia"/>
-        </w:rPr>
-        <w:t xml:space="preserve"> Dopodrobna bude databáze popsána níže v této dokumentaci.</w:t>
-      </w:r>
-    </w:p>
-    <w:p>
-      <w:pPr>
-        <w:ind w:firstLine="576"/>
-        <w:rPr>
-          <w:rFonts w:eastAsiaTheme="majorEastAsia"/>
-        </w:rPr>
-      </w:pPr>
-      <w:proofErr w:type="spellStart"/>
-      <w:r>
-        <w:rPr>
-          <w:rFonts w:eastAsiaTheme="majorEastAsia"/>
-          <w:b/>
-          <w:bCs/>
-        </w:rPr>
-        <w:t>MySQL</w:t>
-      </w:r>
-      <w:proofErr w:type="spellEnd"/>
-      <w:r>
-        <w:rPr>
-          <w:rFonts w:eastAsiaTheme="majorEastAsia"/>
-          <w:b/>
-          <w:bCs/>
-        </w:rPr>
-        <w:t xml:space="preserve"> </w:t>
-      </w:r>
-      <w:proofErr w:type="spellStart"/>
-      <w:r>
-        <w:rPr>
-          <w:rFonts w:eastAsiaTheme="majorEastAsia"/>
-          <w:b/>
-          <w:bCs/>
-        </w:rPr>
-        <w:t>Workbench</w:t>
-      </w:r>
-      <w:proofErr w:type="spellEnd"/>
-      <w:r>
-        <w:rPr>
-          <w:rFonts w:eastAsiaTheme="majorEastAsia"/>
-        </w:rPr>
-        <w:t xml:space="preserve">, který využívám pro usnadnění práce s databází, je </w:t>
-      </w:r>
-      <w:r>
-        <w:rPr>
-          <w:rFonts w:eastAsiaTheme="majorEastAsia"/>
-        </w:rPr>
-        <w:t>pokročilé grafické uživatelské rozhraní, které umožňuje vizuální návrh databáze, správu a ladění SQL dotazů, monitorování výkonu a celkovou správu databázového systému.</w:t>
-      </w:r>
-    </w:p>
-    <w:p>
-      <w:pPr>
-        <w:ind w:firstLine="576"/>
-        <w:rPr>
-          <w:rFonts w:eastAsiaTheme="majorEastAsia"/>
-        </w:rPr>
-      </w:pPr>
-      <w:r>
-        <w:rPr>
-          <w:rFonts w:eastAsiaTheme="majorEastAsia"/>
-          <w:b/>
-          <w:bCs/>
-        </w:rPr>
-        <w:t>XAMPP</w:t>
-      </w:r>
-      <w:r>
-        <w:rPr>
-          <w:rFonts w:eastAsiaTheme="majorEastAsia"/>
-        </w:rPr>
-        <w:t xml:space="preserve">, který využívám pro práci se serverem </w:t>
-      </w:r>
-      <w:proofErr w:type="spellStart"/>
-      <w:r>
-        <w:rPr>
-          <w:rFonts w:eastAsiaTheme="majorEastAsia"/>
-        </w:rPr>
-        <w:t>MySQL</w:t>
-      </w:r>
-      <w:proofErr w:type="spellEnd"/>
-      <w:r>
-        <w:rPr>
-          <w:rFonts w:eastAsiaTheme="majorEastAsia"/>
-        </w:rPr>
-        <w:t xml:space="preserve">, je balíček softwarových nástrojů určených pro lokální vývoj a testování webových aplikací. XAMPP obsahuje </w:t>
-      </w:r>
-      <w:proofErr w:type="spellStart"/>
-      <w:r>
-        <w:rPr>
-          <w:rFonts w:eastAsiaTheme="majorEastAsia"/>
-        </w:rPr>
-        <w:t>Apache</w:t>
-      </w:r>
-      <w:proofErr w:type="spellEnd"/>
-      <w:r>
-        <w:rPr>
-          <w:rFonts w:eastAsiaTheme="majorEastAsia"/>
-        </w:rPr>
-        <w:t xml:space="preserve">, </w:t>
-      </w:r>
-      <w:proofErr w:type="spellStart"/>
-      <w:r>
-        <w:rPr>
-          <w:rFonts w:eastAsiaTheme="majorEastAsia"/>
-        </w:rPr>
-        <w:t>MySQL</w:t>
-      </w:r>
-      <w:proofErr w:type="spellEnd"/>
-      <w:r>
-        <w:rPr>
-          <w:rFonts w:eastAsiaTheme="majorEastAsia"/>
-        </w:rPr>
-        <w:t>, PHP a Perl, a díky svému jednoduchému nastavení umožňuje rychle nasadit a spravovat databázový server v lokálním prostředí.</w:t>
-      </w:r>
-    </w:p>
-    <w:p>
-      <w:pPr>
-        <w:pStyle w:val="Nadpis2"/>
-      </w:pPr>
-      <w:bookmarkStart w:id="23" w:name="_Toc191402524"/>
-      <w:r>
-        <w:t>Tvorba</w:t>
-      </w:r>
-      <w:r>
-        <w:t xml:space="preserve"> uživatelského rozhraní</w:t>
-      </w:r>
-      <w:bookmarkEnd w:id="23"/>
-    </w:p>
-    <w:p>
-      <w:pPr>
-        <w:ind w:firstLine="432"/>
-        <w:rPr>
-          <w:rFonts w:eastAsiaTheme="majorEastAsia"/>
-        </w:rPr>
-      </w:pPr>
-      <w:proofErr w:type="spellStart"/>
-      <w:r>
-        <w:rPr>
-          <w:rFonts w:eastAsiaTheme="majorEastAsia"/>
-          <w:b/>
-          <w:bCs/>
-        </w:rPr>
-        <w:t>JavaFX</w:t>
-      </w:r>
-      <w:proofErr w:type="spellEnd"/>
-      <w:r>
-        <w:rPr>
-          <w:rFonts w:eastAsiaTheme="majorEastAsia"/>
-        </w:rPr>
-        <w:t xml:space="preserve"> je moderní platforma pro tvorbu uživatelských rozhraní v Javě. Podporuje práci s grafikou, multimédii a animacemi a je</w:t>
-      </w:r>
-      <w:r>
-        <w:rPr>
-          <w:rFonts w:eastAsiaTheme="majorEastAsia"/>
-        </w:rPr>
-        <w:t xml:space="preserve"> často</w:t>
-      </w:r>
-      <w:r>
-        <w:rPr>
-          <w:rFonts w:eastAsiaTheme="majorEastAsia"/>
-        </w:rPr>
-        <w:t xml:space="preserve"> základem pro desktopové aplikace.</w:t>
-      </w:r>
-    </w:p>
-    <w:p>
-      <w:pPr>
-        <w:ind w:firstLine="432"/>
-        <w:rPr>
-          <w:rFonts w:eastAsiaTheme="majorEastAsia"/>
-        </w:rPr>
-      </w:pPr>
-      <w:r>
-        <w:rPr>
-          <w:rFonts w:eastAsiaTheme="majorEastAsia"/>
-          <w:b/>
-          <w:bCs/>
-        </w:rPr>
-        <w:t>FXML</w:t>
-      </w:r>
-      <w:r>
-        <w:rPr>
-          <w:rFonts w:eastAsiaTheme="majorEastAsia"/>
-        </w:rPr>
-        <w:t xml:space="preserve"> je deklarativní jazyk</w:t>
-      </w:r>
-      <w:r>
-        <w:rPr>
-          <w:rFonts w:eastAsiaTheme="majorEastAsia"/>
-        </w:rPr>
-        <w:t xml:space="preserve"> založený na XML</w:t>
-      </w:r>
-      <w:r>
-        <w:rPr>
-          <w:rFonts w:eastAsiaTheme="majorEastAsia"/>
-        </w:rPr>
-        <w:t xml:space="preserve"> pro popis grafického uživatelského rozhraní v </w:t>
-      </w:r>
-      <w:proofErr w:type="spellStart"/>
-      <w:r>
-        <w:rPr>
-          <w:rFonts w:eastAsiaTheme="majorEastAsia"/>
-        </w:rPr>
-        <w:t>JavaFX</w:t>
-      </w:r>
-      <w:proofErr w:type="spellEnd"/>
-      <w:r>
-        <w:rPr>
-          <w:rFonts w:eastAsiaTheme="majorEastAsia"/>
-        </w:rPr>
-        <w:t>. Umožňuje oddělit design UI od aplikační logiky, což přispívá k lepší udržovatelnosti a přehlednosti kódu.</w:t>
-      </w:r>
-    </w:p>
-    <w:p>
-      <w:pPr>
-        <w:ind w:firstLine="432"/>
-        <w:rPr>
-          <w:rFonts w:eastAsiaTheme="majorEastAsia"/>
-        </w:rPr>
-      </w:pPr>
-      <w:proofErr w:type="spellStart"/>
-      <w:r>
-        <w:rPr>
-          <w:b/>
-          <w:bCs/>
-        </w:rPr>
-        <w:lastRenderedPageBreak/>
-        <w:t>JavaFX</w:t>
-      </w:r>
-      <w:proofErr w:type="spellEnd"/>
-      <w:r>
-        <w:rPr>
-          <w:b/>
-          <w:bCs/>
-        </w:rPr>
-        <w:t xml:space="preserve"> </w:t>
-      </w:r>
-      <w:proofErr w:type="spellStart"/>
-      <w:r>
-        <w:rPr>
-          <w:b/>
-          <w:bCs/>
-        </w:rPr>
-        <w:t>Maven</w:t>
-      </w:r>
-      <w:proofErr w:type="spellEnd"/>
-      <w:r>
-        <w:rPr>
-          <w:b/>
-          <w:bCs/>
-        </w:rPr>
-        <w:t xml:space="preserve"> Plugin</w:t>
-      </w:r>
-      <w:r>
-        <w:t xml:space="preserve"> usnadňuje správu a spouštění </w:t>
-      </w:r>
-      <w:proofErr w:type="spellStart"/>
-      <w:r>
-        <w:t>JavaFX</w:t>
-      </w:r>
-      <w:proofErr w:type="spellEnd"/>
-      <w:r>
-        <w:t xml:space="preserve"> aplikací pomocí </w:t>
-      </w:r>
-      <w:proofErr w:type="spellStart"/>
-      <w:r>
-        <w:t>Apache</w:t>
-      </w:r>
-      <w:proofErr w:type="spellEnd"/>
-      <w:r>
-        <w:t xml:space="preserve"> </w:t>
-      </w:r>
-      <w:proofErr w:type="spellStart"/>
-      <w:r>
-        <w:t>Maven</w:t>
-      </w:r>
-      <w:proofErr w:type="spellEnd"/>
-      <w:r>
-        <w:t xml:space="preserve">. Plugin integruje spouštěcí mechanismus </w:t>
-      </w:r>
-      <w:proofErr w:type="spellStart"/>
-      <w:r>
-        <w:t>JavaFX</w:t>
-      </w:r>
-      <w:proofErr w:type="spellEnd"/>
-      <w:r>
-        <w:t xml:space="preserve"> do </w:t>
-      </w:r>
-      <w:proofErr w:type="spellStart"/>
-      <w:r>
-        <w:t>Maven</w:t>
-      </w:r>
-      <w:proofErr w:type="spellEnd"/>
-      <w:r>
-        <w:t xml:space="preserve"> build procesu, což umožňuje snadné spouštění a balení aplikace</w:t>
-      </w:r>
-      <w:r>
-        <w:t>.</w:t>
-      </w:r>
-    </w:p>
-    <w:p>
-      <w:pPr>
-        <w:ind w:firstLine="432"/>
-        <w:rPr>
-          <w:rFonts w:eastAsiaTheme="majorEastAsia"/>
-        </w:rPr>
-      </w:pPr>
-      <w:r>
-        <w:rPr>
-          <w:rFonts w:eastAsiaTheme="majorEastAsia"/>
-          <w:b/>
-          <w:bCs/>
-        </w:rPr>
-        <w:t>CSS</w:t>
-      </w:r>
-      <w:r>
-        <w:rPr>
-          <w:rFonts w:eastAsiaTheme="majorEastAsia"/>
-        </w:rPr>
-        <w:t xml:space="preserve"> (</w:t>
-      </w:r>
-      <w:proofErr w:type="spellStart"/>
-      <w:r>
-        <w:rPr>
-          <w:rFonts w:eastAsiaTheme="majorEastAsia"/>
-        </w:rPr>
-        <w:t>Cascading</w:t>
-      </w:r>
-      <w:proofErr w:type="spellEnd"/>
-      <w:r>
-        <w:rPr>
-          <w:rFonts w:eastAsiaTheme="majorEastAsia"/>
-        </w:rPr>
-        <w:t xml:space="preserve"> Style </w:t>
-      </w:r>
-      <w:proofErr w:type="spellStart"/>
-      <w:r>
-        <w:rPr>
-          <w:rFonts w:eastAsiaTheme="majorEastAsia"/>
-        </w:rPr>
-        <w:t>Sheets</w:t>
-      </w:r>
-      <w:proofErr w:type="spellEnd"/>
-      <w:r>
-        <w:rPr>
-          <w:rFonts w:eastAsiaTheme="majorEastAsia"/>
-        </w:rPr>
-        <w:t xml:space="preserve">) v kontextu </w:t>
-      </w:r>
-      <w:proofErr w:type="spellStart"/>
-      <w:r>
-        <w:rPr>
-          <w:rFonts w:eastAsiaTheme="majorEastAsia"/>
-        </w:rPr>
-        <w:t>JavaFX</w:t>
-      </w:r>
-      <w:proofErr w:type="spellEnd"/>
-      <w:r>
-        <w:rPr>
-          <w:rFonts w:eastAsiaTheme="majorEastAsia"/>
-        </w:rPr>
-        <w:t xml:space="preserve"> se od standardního CSS liší především tím, že je speciálně optimalizované pro stylování grafických komponent (Node) v prostředí </w:t>
-      </w:r>
-      <w:proofErr w:type="spellStart"/>
-      <w:r>
-        <w:rPr>
-          <w:rFonts w:eastAsiaTheme="majorEastAsia"/>
-        </w:rPr>
-        <w:t>JavaFX</w:t>
-      </w:r>
-      <w:proofErr w:type="spellEnd"/>
-      <w:r>
-        <w:rPr>
-          <w:rFonts w:eastAsiaTheme="majorEastAsia"/>
-        </w:rPr>
-        <w:t xml:space="preserve">. Zatímco standardní CSS se primárně používá pro webové stránky a má předdefinovaný soubor vlastností pro HTML elementy, CSS pro </w:t>
-      </w:r>
-      <w:proofErr w:type="spellStart"/>
-      <w:r>
-        <w:rPr>
-          <w:rFonts w:eastAsiaTheme="majorEastAsia"/>
-        </w:rPr>
-        <w:t>JavaFX</w:t>
-      </w:r>
-      <w:proofErr w:type="spellEnd"/>
-      <w:r>
-        <w:rPr>
-          <w:rFonts w:eastAsiaTheme="majorEastAsia"/>
-        </w:rPr>
-        <w:t xml:space="preserve"> obsahuje rozšířenou sadu vlastností, které odpovídají specifickým atributům a vlastnostem </w:t>
-      </w:r>
-      <w:proofErr w:type="spellStart"/>
-      <w:r>
-        <w:rPr>
-          <w:rFonts w:eastAsiaTheme="majorEastAsia"/>
-        </w:rPr>
-        <w:t>JavaFX</w:t>
-      </w:r>
-      <w:proofErr w:type="spellEnd"/>
-      <w:r>
-        <w:rPr>
-          <w:rFonts w:eastAsiaTheme="majorEastAsia"/>
-        </w:rPr>
-        <w:t xml:space="preserve"> ovládacích prvků.</w:t>
-      </w:r>
-    </w:p>
-    <w:p>
-      <w:pPr>
-        <w:ind w:firstLine="432"/>
-        <w:rPr>
-          <w:rFonts w:eastAsiaTheme="majorEastAsia"/>
-        </w:rPr>
-      </w:pPr>
-      <w:r>
-        <w:rPr>
-          <w:rFonts w:eastAsiaTheme="majorEastAsia"/>
-        </w:rPr>
-        <w:t>S</w:t>
-      </w:r>
-      <w:r>
-        <w:rPr>
-          <w:rFonts w:eastAsiaTheme="majorEastAsia"/>
-        </w:rPr>
-        <w:t xml:space="preserve">truktura a syntaxe </w:t>
-      </w:r>
-      <w:r>
-        <w:rPr>
-          <w:rFonts w:eastAsiaTheme="majorEastAsia"/>
-        </w:rPr>
-        <w:t>je tedy</w:t>
-      </w:r>
-      <w:r>
-        <w:rPr>
-          <w:rFonts w:eastAsiaTheme="majorEastAsia"/>
-        </w:rPr>
-        <w:t xml:space="preserve"> mírně </w:t>
-      </w:r>
-      <w:r>
-        <w:rPr>
-          <w:rFonts w:eastAsiaTheme="majorEastAsia"/>
-        </w:rPr>
-        <w:t>jiná</w:t>
-      </w:r>
-      <w:r>
-        <w:rPr>
-          <w:rFonts w:eastAsiaTheme="majorEastAsia"/>
-        </w:rPr>
-        <w:t xml:space="preserve">, aby efektivně pracovala s hierarchií uzlů v </w:t>
-      </w:r>
-      <w:proofErr w:type="spellStart"/>
-      <w:r>
-        <w:rPr>
-          <w:rFonts w:eastAsiaTheme="majorEastAsia"/>
-        </w:rPr>
-        <w:t>JavaFX</w:t>
-      </w:r>
-      <w:proofErr w:type="spellEnd"/>
-      <w:r>
-        <w:rPr>
-          <w:rFonts w:eastAsiaTheme="majorEastAsia"/>
-        </w:rPr>
-        <w:t xml:space="preserve"> scéně, což umožňuje detailní a flexibilní úpravu vzhledu desktopových aplikací postavených na této platformě.</w:t>
-      </w:r>
-    </w:p>
-    <w:p>
-      <w:pPr>
-        <w:pStyle w:val="Nadpis2"/>
-      </w:pPr>
-      <w:bookmarkStart w:id="24" w:name="_Toc191402525"/>
-      <w:r>
-        <w:t>Ostatní knihovny</w:t>
-      </w:r>
-      <w:bookmarkEnd w:id="24"/>
-    </w:p>
-    <w:p>
-      <w:pPr>
-        <w:ind w:firstLine="578"/>
-      </w:pPr>
-      <w:proofErr w:type="spellStart"/>
-      <w:r>
-        <w:rPr>
-          <w:b/>
-          <w:bCs/>
-        </w:rPr>
-        <w:t>Gson</w:t>
-      </w:r>
-      <w:proofErr w:type="spellEnd"/>
-      <w:r>
-        <w:t xml:space="preserve"> </w:t>
-      </w:r>
-      <w:r>
-        <w:t>(</w:t>
-      </w:r>
-      <w:proofErr w:type="spellStart"/>
-      <w:r>
-        <w:rPr>
-          <w:rStyle w:val="KdChar"/>
-        </w:rPr>
-        <w:t>com.google.code.gson</w:t>
-      </w:r>
-      <w:proofErr w:type="spellEnd"/>
-      <w:r>
-        <w:t xml:space="preserve">) je knihovna od společnosti Google pro </w:t>
-      </w:r>
-      <w:proofErr w:type="spellStart"/>
-      <w:r>
-        <w:t>parsování</w:t>
-      </w:r>
-      <w:proofErr w:type="spellEnd"/>
-      <w:r>
-        <w:t xml:space="preserve"> </w:t>
-      </w:r>
-      <w:r>
-        <w:t>Java objektů do formátu JSON a naopak. Umožňuje snadnou konverzi dat mezi Java objekty a jejich reprezentací ve formátu JSON, což je využíváno v komunikaci s API a další manipulaci s daty.</w:t>
-      </w:r>
-    </w:p>
-    <w:p>
-      <w:pPr>
-        <w:ind w:firstLine="578"/>
-      </w:pPr>
-      <w:proofErr w:type="spellStart"/>
-      <w:r>
-        <w:rPr>
-          <w:b/>
-          <w:bCs/>
-        </w:rPr>
-        <w:t>Dotenv</w:t>
-      </w:r>
-      <w:proofErr w:type="spellEnd"/>
-      <w:r>
-        <w:t xml:space="preserve"> </w:t>
-      </w:r>
-      <w:r>
-        <w:t>(</w:t>
-      </w:r>
-      <w:proofErr w:type="spellStart"/>
-      <w:r>
-        <w:rPr>
-          <w:rStyle w:val="KdChar"/>
-        </w:rPr>
-        <w:t>io.github.cdimascio.dotenv-java</w:t>
-      </w:r>
-      <w:proofErr w:type="spellEnd"/>
-      <w:r>
-        <w:t>) je knihovna umožňující načítání konfiguračních proměnných z prostředí (</w:t>
-      </w:r>
-      <w:r>
-        <w:rPr>
-          <w:rStyle w:val="KdChar"/>
-        </w:rPr>
-        <w:t>.</w:t>
-      </w:r>
-      <w:proofErr w:type="spellStart"/>
-      <w:r>
-        <w:rPr>
-          <w:rStyle w:val="KdChar"/>
-        </w:rPr>
-        <w:t>env</w:t>
-      </w:r>
-      <w:proofErr w:type="spellEnd"/>
-      <w:r>
-        <w:t xml:space="preserve"> souboru). To usnadňuje správu citlivých informací a konfigurací bez nutnosti </w:t>
-      </w:r>
-      <w:proofErr w:type="spellStart"/>
-      <w:r>
-        <w:t>hardcodovat</w:t>
-      </w:r>
-      <w:proofErr w:type="spellEnd"/>
-      <w:r>
-        <w:t xml:space="preserve"> je přímo v kódu. </w:t>
-      </w:r>
-    </w:p>
-    <w:p>
-      <w:pPr>
-        <w:ind w:firstLine="578"/>
-      </w:pPr>
-      <w:proofErr w:type="spellStart"/>
-      <w:r>
-        <w:rPr>
-          <w:b/>
-          <w:bCs/>
-        </w:rPr>
-        <w:t>Apache</w:t>
-      </w:r>
-      <w:proofErr w:type="spellEnd"/>
-      <w:r>
-        <w:rPr>
-          <w:b/>
-          <w:bCs/>
-        </w:rPr>
-        <w:t xml:space="preserve"> POI</w:t>
-      </w:r>
-      <w:r>
-        <w:t xml:space="preserve"> (</w:t>
-      </w:r>
-      <w:proofErr w:type="spellStart"/>
-      <w:r>
-        <w:rPr>
-          <w:rStyle w:val="KdChar"/>
-        </w:rPr>
-        <w:t>org.apache.poi.xwpf.usermodel</w:t>
-      </w:r>
-      <w:proofErr w:type="spellEnd"/>
-      <w:r>
-        <w:t>)</w:t>
-      </w:r>
-      <w:r>
-        <w:t xml:space="preserve"> je knihovna, která umožňuje vytvářet a manipulovat s dokumenty ve formátech Microsoft Office. V projektu je využívána ke generování testů ve formátu </w:t>
-      </w:r>
-      <w:r>
-        <w:t>*.docx</w:t>
-      </w:r>
-      <w:r>
-        <w:t>, přičemž umožňuje dynamické vytváření dokumentů s formátovaným textem a dalšími prvky.</w:t>
-      </w:r>
-    </w:p>
-    <w:p>
-      <w:r>
-        <w:br w:type="page"/>
-      </w:r>
-    </w:p>
-    <w:p>
-      <w:pPr>
-        <w:pStyle w:val="Nadpis1"/>
-      </w:pPr>
-      <w:bookmarkStart w:id="25" w:name="_Toc191402526"/>
-      <w:r>
-        <w:lastRenderedPageBreak/>
-        <w:t>Struktura databáze</w:t>
-      </w:r>
-      <w:bookmarkEnd w:id="25"/>
-    </w:p>
-    <w:p>
-      <w:r>
-        <w:tab/>
-      </w:r>
-      <w:r>
-        <w:t>Než</w:t>
-      </w:r>
-      <w:r>
-        <w:t xml:space="preserve"> rozeberu souborovou strukturu, funkčnosti, třídy, jejich metody a konkrétní ukázky kódů aplikace, představím samotnou databázi, na které celá aplikace stojí a bez které by neměla šanci správně fungovat.</w:t>
-      </w:r>
-    </w:p>
-    <w:p>
-      <w:pPr>
-        <w:spacing w:before="0" w:after="160" w:line="259" w:lineRule="auto"/>
-      </w:pPr>
-      <w:r>
-        <w:br w:type="page"/>
-      </w:r>
-    </w:p>
-    <w:p>
-      <w:pPr>
-        <w:pStyle w:val="Neslovannadpis"/>
-      </w:pPr>
-      <w:r>
-        <w:lastRenderedPageBreak/>
-        <w:t>Seznam použitých pojmů a zkratek</w:t>
-      </w:r>
-    </w:p>
-    <w:p>
-      <w:pPr>
-        <w:ind w:firstLine="360"/>
-      </w:pPr>
-      <w:r>
-        <w:rPr>
-          <w:b/>
-          <w:bCs/>
-        </w:rPr>
-        <w:t>AI</w:t>
-      </w:r>
-      <w:r>
-        <w:t xml:space="preserve"> (</w:t>
-      </w:r>
-      <w:r>
-        <w:rPr>
-          <w:i/>
-          <w:iCs/>
-        </w:rPr>
-        <w:t>neboli</w:t>
-      </w:r>
-      <w:r>
-        <w:t xml:space="preserve"> </w:t>
-      </w:r>
-      <w:proofErr w:type="spellStart"/>
-      <w:r>
-        <w:rPr>
           <w:b/>
           <w:bCs/>
           <w:i/>
           <w:iCs/>
         </w:rPr>
-        <w:t>artificial</w:t>
-      </w:r>
-      <w:proofErr w:type="spellEnd"/>
-      <w:r>
-        <w:rPr>
+        <w:t>Java</w:t>
+      </w:r>
+      <w:r>
+        <w:rPr>
+          <w:rFonts w:eastAsiaTheme="majorEastAsia"/>
+        </w:rPr>
+        <w:t xml:space="preserve"> </w:t>
+      </w:r>
+      <w:r>
+        <w:rPr>
+          <w:rFonts w:eastAsiaTheme="majorEastAsia"/>
+        </w:rPr>
+        <w:t>je objektově orientovaný programovací jazyk, který se široce využívá pro vývoj aplikací různých typů – desktopových, webových či mobilních.</w:t>
+      </w:r>
+      <w:r>
+        <w:rPr>
+          <w:rFonts w:eastAsiaTheme="majorEastAsia"/>
+        </w:rPr>
+        <w:t xml:space="preserve"> Právě z tohoto důvodu jsem tento jazyk zvolil pro tvorbu aplikace.</w:t>
+      </w:r>
+    </w:p>
+    <w:p>
+      <w:pPr>
+        <w:ind w:firstLine="432"/>
+        <w:rPr>
+          <w:rFonts w:eastAsiaTheme="majorEastAsia"/>
+        </w:rPr>
+      </w:pPr>
+      <w:r>
+        <w:rPr>
+          <w:rFonts w:eastAsiaTheme="majorEastAsia"/>
           <w:b/>
           <w:bCs/>
           <w:i/>
           <w:iCs/>
         </w:rPr>
-        <w:t xml:space="preserve"> </w:t>
-      </w:r>
-      <w:proofErr w:type="spellStart"/>
-      <w:r>
-        <w:rPr>
+        <w:t>JDK</w:t>
+      </w:r>
+      <w:r>
+        <w:rPr>
+          <w:rFonts w:eastAsiaTheme="majorEastAsia"/>
+        </w:rPr>
+        <w:t xml:space="preserve"> (</w:t>
+      </w:r>
+      <w:r>
+        <w:rPr>
+          <w:rFonts w:eastAsiaTheme="majorEastAsia"/>
+          <w:i/>
+          <w:iCs/>
+        </w:rPr>
+        <w:t>Java Development Kit</w:t>
+      </w:r>
+      <w:r>
+        <w:rPr>
+          <w:rFonts w:eastAsiaTheme="majorEastAsia"/>
+        </w:rPr>
+        <w:t xml:space="preserve">) je základní balík nástrojů a knihoven, které jsou nezbytné pro vývoj a běh aplikací psaných v jazyce Java. V této aplikaci se využívá </w:t>
+      </w:r>
+      <w:r>
+        <w:rPr>
+          <w:rFonts w:eastAsiaTheme="majorEastAsia"/>
+          <w:i/>
+          <w:iCs/>
+        </w:rPr>
+        <w:t>JDK</w:t>
+      </w:r>
+      <w:r>
+        <w:rPr>
+          <w:rFonts w:eastAsiaTheme="majorEastAsia"/>
+        </w:rPr>
+        <w:t xml:space="preserve"> verze 21, což představuje jednu z jeho nejnovějších verzí, a nabízí tedy aktuální funkce a optimalizace, které přispívají k efektivnějšímu vývoji a vyššímu výkonu aplikací.</w:t>
+      </w:r>
+    </w:p>
+    <w:p>
+      <w:pPr>
+        <w:pStyle w:val="Nadpis2"/>
+      </w:pPr>
+      <w:bookmarkStart w:id="20" w:name="_Toc191402521"/>
+      <w:r>
+        <w:t>Vývojové prostředí</w:t>
+      </w:r>
+      <w:bookmarkEnd w:id="20"/>
+    </w:p>
+    <w:p>
+      <w:pPr>
+        <w:ind w:firstLine="576"/>
+        <w:rPr>
+          <w:rFonts w:eastAsiaTheme="majorEastAsia"/>
+        </w:rPr>
+      </w:pPr>
+      <w:r>
+        <w:rPr>
+          <w:rFonts w:eastAsiaTheme="majorEastAsia"/>
           <w:b/>
           <w:bCs/>
           <w:i/>
           <w:iCs/>
         </w:rPr>
-        <w:t>intelligence</w:t>
-      </w:r>
-      <w:proofErr w:type="spellEnd"/>
-      <w:r>
-        <w:t xml:space="preserve"> – česky</w:t>
-      </w:r>
-      <w:r>
+        <w:t>IntelliJ</w:t>
+      </w:r>
+      <w:r>
+        <w:rPr>
+          <w:rFonts w:eastAsiaTheme="majorEastAsia"/>
+          <w:b/>
+          <w:bCs/>
+        </w:rPr>
         <w:t xml:space="preserve"> </w:t>
       </w:r>
       <w:r>
         <w:rPr>
+          <w:rFonts w:eastAsiaTheme="majorEastAsia"/>
           <w:b/>
           <w:bCs/>
           <w:i/>
           <w:iCs/>
         </w:rPr>
-        <w:t>umělá</w:t>
-      </w:r>
-      <w:r>
-        <w:rPr>
-          <w:b/>
-          <w:bCs/>
-        </w:rPr>
-        <w:t xml:space="preserve"> </w:t>
-      </w:r>
-      <w:r>
-        <w:rPr>
+        <w:t>IDEA</w:t>
+      </w:r>
+      <w:r>
+        <w:rPr>
+          <w:rFonts w:eastAsiaTheme="majorEastAsia"/>
+        </w:rPr>
+        <w:t xml:space="preserve"> je přední integrované vývojové prostředí (</w:t>
+      </w:r>
+      <w:r>
+        <w:rPr>
+          <w:rFonts w:eastAsiaTheme="majorEastAsia"/>
+          <w:i/>
+          <w:iCs/>
+        </w:rPr>
+        <w:t>IDE</w:t>
+      </w:r>
+      <w:r>
+        <w:rPr>
+          <w:rFonts w:eastAsiaTheme="majorEastAsia"/>
+        </w:rPr>
+        <w:t xml:space="preserve">) od společnosti </w:t>
+      </w:r>
+      <w:r>
+        <w:rPr>
+          <w:rFonts w:eastAsiaTheme="majorEastAsia"/>
+          <w:i/>
+          <w:iCs/>
+        </w:rPr>
+        <w:t>JetBrains</w:t>
+      </w:r>
+      <w:r>
+        <w:rPr>
+          <w:rFonts w:eastAsiaTheme="majorEastAsia"/>
+        </w:rPr>
+        <w:t>, které podporuje řadu programovacích jazyků, se zvláštním důrazem na Javu. Poskytuje</w:t>
+      </w:r>
+      <w:r>
+        <w:rPr>
+          <w:rFonts w:eastAsiaTheme="majorEastAsia"/>
+        </w:rPr>
+        <w:t xml:space="preserve"> například</w:t>
+      </w:r>
+      <w:r>
+        <w:rPr>
+          <w:rFonts w:eastAsiaTheme="majorEastAsia"/>
+        </w:rPr>
+        <w:t xml:space="preserve"> inteligentní asistenci, </w:t>
+      </w:r>
+      <w:r>
+        <w:rPr>
+          <w:rFonts w:eastAsiaTheme="majorEastAsia"/>
+          <w:i/>
+          <w:iCs/>
+        </w:rPr>
+        <w:t>refa</w:t>
+      </w:r>
+      <w:r>
+        <w:rPr>
+          <w:rFonts w:eastAsiaTheme="majorEastAsia"/>
+          <w:i/>
+          <w:iCs/>
+        </w:rPr>
+        <w:t>c</w:t>
+      </w:r>
+      <w:r>
+        <w:rPr>
+          <w:rFonts w:eastAsiaTheme="majorEastAsia"/>
+          <w:i/>
+          <w:iCs/>
+        </w:rPr>
+        <w:t>toring</w:t>
+      </w:r>
+      <w:r>
+        <w:rPr>
+          <w:rFonts w:eastAsiaTheme="majorEastAsia"/>
+        </w:rPr>
+        <w:t xml:space="preserve"> a </w:t>
+      </w:r>
+      <w:r>
+        <w:rPr>
+          <w:rFonts w:eastAsiaTheme="majorEastAsia"/>
+          <w:i/>
+          <w:iCs/>
+        </w:rPr>
+        <w:t>debugging</w:t>
+      </w:r>
+      <w:r>
+        <w:rPr>
+          <w:rFonts w:eastAsiaTheme="majorEastAsia"/>
+        </w:rPr>
+        <w:t>, což značně urychluje vývoj softwaru.</w:t>
+      </w:r>
+    </w:p>
+    <w:p>
+      <w:pPr>
+        <w:ind w:firstLine="576"/>
+        <w:rPr>
+          <w:rFonts w:eastAsiaTheme="majorEastAsia"/>
+        </w:rPr>
+      </w:pPr>
+      <w:r>
+        <w:rPr>
+          <w:rFonts w:eastAsiaTheme="majorEastAsia"/>
           <w:b/>
           <w:bCs/>
           <w:i/>
           <w:iCs/>
         </w:rPr>
-        <w:t>inteligence</w:t>
-      </w:r>
-      <w:r>
-        <w:t>)</w:t>
-      </w:r>
-      <w:r>
-        <w:t xml:space="preserve"> je obor informatiky, který se zabývá tvorbou systémů schopných vykazovat rysy lidské inteligence – například učení, rozhodování a řešení problémů – prostřednictvím algoritmů a strojového učení.</w:t>
+        <w:t>Scene</w:t>
+      </w:r>
+      <w:r>
+        <w:rPr>
+          <w:rFonts w:eastAsiaTheme="majorEastAsia"/>
+          <w:b/>
+          <w:bCs/>
+        </w:rPr>
+        <w:t xml:space="preserve"> </w:t>
+      </w:r>
+      <w:r>
+        <w:rPr>
+          <w:rFonts w:eastAsiaTheme="majorEastAsia"/>
+          <w:b/>
+          <w:bCs/>
+          <w:i/>
+          <w:iCs/>
+        </w:rPr>
+        <w:t>Builder</w:t>
+      </w:r>
+      <w:r>
+        <w:rPr>
+          <w:rFonts w:eastAsiaTheme="majorEastAsia"/>
+        </w:rPr>
+        <w:t xml:space="preserve"> je vizuální nástroj pro tvorbu a úpravu </w:t>
+      </w:r>
+      <w:r>
+        <w:rPr>
+          <w:rFonts w:eastAsiaTheme="majorEastAsia"/>
+          <w:i/>
+          <w:iCs/>
+        </w:rPr>
+        <w:t>FXML</w:t>
+      </w:r>
+      <w:r>
+        <w:rPr>
+          <w:rFonts w:eastAsiaTheme="majorEastAsia"/>
+        </w:rPr>
+        <w:t xml:space="preserve"> souborů, které definují grafické rozhraní v aplikacích založených na </w:t>
+      </w:r>
+      <w:r>
+        <w:rPr>
+          <w:rFonts w:eastAsiaTheme="majorEastAsia"/>
+          <w:i/>
+          <w:iCs/>
+        </w:rPr>
+        <w:t>JavaFX</w:t>
+      </w:r>
+      <w:r>
+        <w:rPr>
+          <w:rFonts w:eastAsiaTheme="majorEastAsia"/>
+        </w:rPr>
+        <w:t>. Umožňuje návrhářům a vývojářům snadno vytvářet uživatelská rozhraní pomocí drag-and-drop prvků.</w:t>
       </w:r>
     </w:p>
     <w:p>
       <w:pPr>
-        <w:ind w:firstLine="360"/>
+        <w:pStyle w:val="Nadpis2"/>
+      </w:pPr>
+      <w:bookmarkStart w:id="21" w:name="_Toc191402522"/>
+      <w:r>
+        <w:t>Buildovací a verzovací nástroje</w:t>
+      </w:r>
+      <w:bookmarkEnd w:id="21"/>
+    </w:p>
+    <w:p>
+      <w:pPr>
+        <w:ind w:firstLine="576"/>
       </w:pPr>
       <w:r>
         <w:rPr>
           <w:b/>
           <w:bCs/>
-        </w:rPr>
-        <w:t>AI halucinace</w:t>
-      </w:r>
-      <w:r>
-        <w:t xml:space="preserve"> označuje fenomén, kdy umělá inteligence generuje nesprávné, smyšlené nebo nesouvisející informace bez opory v ověřitelných datech, což může vést k nepřesným či zavádějícím výsledkům.</w:t>
+          <w:i/>
+          <w:iCs/>
+        </w:rPr>
+        <w:t>Závislost</w:t>
+      </w:r>
+      <w:r>
+        <w:t xml:space="preserve"> (dependency) označuje externí knihovnu nebo balík softwaru, který je nezbytný pro správnou funkci a kompilaci vašeho projektu.</w:t>
       </w:r>
     </w:p>
     <w:p>
       <w:pPr>
-        <w:ind w:firstLine="360"/>
-      </w:pPr>
-      <w:r>
-        <w:rPr>
+        <w:ind w:firstLine="576"/>
+        <w:rPr>
+          <w:rFonts w:eastAsiaTheme="majorEastAsia"/>
+        </w:rPr>
+      </w:pPr>
+      <w:r>
+        <w:rPr>
+          <w:rFonts w:eastAsiaTheme="majorEastAsia"/>
           <w:b/>
           <w:bCs/>
-        </w:rPr>
-        <w:t>Prompt</w:t>
-      </w:r>
-      <w:r>
-        <w:t xml:space="preserve"> je vstupní dotaz nebo instrukce, kterou uživatel poskytuje systému umělé inteligence, aby vyvolal konkrétní odpověď či akci. </w:t>
+          <w:i/>
+          <w:iCs/>
+        </w:rPr>
+        <w:t>Apache</w:t>
+      </w:r>
+      <w:r>
+        <w:rPr>
+          <w:rFonts w:eastAsiaTheme="majorEastAsia"/>
+          <w:b/>
+          <w:bCs/>
+        </w:rPr>
+        <w:t xml:space="preserve"> </w:t>
+      </w:r>
+      <w:r>
+        <w:rPr>
+          <w:rFonts w:eastAsiaTheme="majorEastAsia"/>
+          <w:b/>
+          <w:bCs/>
+          <w:i/>
+          <w:iCs/>
+        </w:rPr>
+        <w:t>Maven</w:t>
+      </w:r>
+      <w:r>
+        <w:rPr>
+          <w:rFonts w:eastAsiaTheme="majorEastAsia"/>
+        </w:rPr>
+        <w:t xml:space="preserve"> je buildovací a projektový nástroj, který se používá ke správě závislostí</w:t>
+      </w:r>
+      <w:r>
+        <w:rPr>
+          <w:rFonts w:eastAsiaTheme="majorEastAsia"/>
+        </w:rPr>
+        <w:t xml:space="preserve"> (dependencies)</w:t>
+      </w:r>
+      <w:r>
+        <w:rPr>
+          <w:rFonts w:eastAsiaTheme="majorEastAsia"/>
+        </w:rPr>
+        <w:t xml:space="preserve">, kompilaci zdrojového kódu, testování a balení výsledných </w:t>
+      </w:r>
+      <w:r>
+        <w:rPr>
+          <w:rFonts w:eastAsiaTheme="majorEastAsia"/>
+        </w:rPr>
+        <w:t>projektů</w:t>
+      </w:r>
+      <w:r>
+        <w:rPr>
+          <w:rFonts w:eastAsiaTheme="majorEastAsia"/>
+        </w:rPr>
+        <w:t>. V</w:t>
+      </w:r>
+      <w:r>
+        <w:rPr>
+          <w:rFonts w:eastAsiaTheme="majorEastAsia"/>
+        </w:rPr>
+        <w:t xml:space="preserve"> mém </w:t>
+      </w:r>
+      <w:r>
+        <w:rPr>
+          <w:rFonts w:eastAsiaTheme="majorEastAsia"/>
+        </w:rPr>
+        <w:t xml:space="preserve">projektu je využíván soubor </w:t>
+      </w:r>
+      <w:r>
+        <w:rPr>
+          <w:rStyle w:val="KdChar"/>
+        </w:rPr>
+        <w:t>pom.xml</w:t>
+      </w:r>
+      <w:r>
+        <w:rPr>
+          <w:rFonts w:eastAsiaTheme="majorEastAsia"/>
+        </w:rPr>
+        <w:t xml:space="preserve"> k definování závislostí a konfiguraci build procesu.</w:t>
       </w:r>
     </w:p>
     <w:p>
       <w:pPr>
-        <w:ind w:firstLine="360"/>
-      </w:pPr>
-      <w:proofErr w:type="spellStart"/>
-      <w:r>
-        <w:rPr>
+        <w:ind w:firstLine="576"/>
+        <w:rPr>
+          <w:rFonts w:eastAsiaTheme="majorEastAsia"/>
+        </w:rPr>
+      </w:pPr>
+      <w:r>
+        <w:rPr>
+          <w:rFonts w:eastAsiaTheme="majorEastAsia"/>
           <w:b/>
           <w:bCs/>
-        </w:rPr>
-        <w:t>Promptování</w:t>
+          <w:i/>
+          <w:iCs/>
+        </w:rPr>
+        <w:t>Git</w:t>
+      </w:r>
+      <w:r>
+        <w:rPr>
+          <w:rFonts w:eastAsiaTheme="majorEastAsia"/>
+        </w:rPr>
+        <w:t xml:space="preserve"> je distribuovaný </w:t>
+      </w:r>
+      <w:proofErr w:type="spellStart"/>
+      <w:r>
+        <w:rPr>
+          <w:rFonts w:eastAsiaTheme="majorEastAsia"/>
+        </w:rPr>
+        <w:t>verzovací</w:t>
       </w:r>
       <w:proofErr w:type="spellEnd"/>
       <w:r>
-        <w:t xml:space="preserve"> je proces formulování</w:t>
-      </w:r>
-      <w:r>
-        <w:t xml:space="preserve"> a</w:t>
-      </w:r>
-      <w:r>
-        <w:t xml:space="preserve"> zadávání promptů.</w:t>
+        <w:rPr>
+          <w:rFonts w:eastAsiaTheme="majorEastAsia"/>
+        </w:rPr>
+        <w:t xml:space="preserve"> systém, který umožňuje sledovat změny v kódu, spolupracovat v týmech a snadno spravovat různé verze vývoje softwaru. </w:t>
+      </w:r>
+      <w:r>
+        <w:rPr>
+          <w:rFonts w:eastAsiaTheme="majorEastAsia"/>
+        </w:rPr>
+        <w:t>V dnešní době je široce rozšířený a j</w:t>
+      </w:r>
+      <w:r>
+        <w:rPr>
+          <w:rFonts w:eastAsiaTheme="majorEastAsia"/>
+        </w:rPr>
+        <w:t>e nezbytným nástrojem pro správu zdrojových kódů a historii projektu.</w:t>
       </w:r>
     </w:p>
     <w:p>
       <w:pPr>
-        <w:ind w:firstLine="360"/>
+        <w:pStyle w:val="Nadpis2"/>
+      </w:pPr>
+      <w:bookmarkStart w:id="22" w:name="_Toc191402523"/>
+      <w:r>
+        <w:t>Databázový systém</w:t>
+      </w:r>
+      <w:bookmarkEnd w:id="22"/>
+    </w:p>
+    <w:p>
+      <w:pPr>
+        <w:ind w:firstLine="576"/>
         <w:rPr>
           <w:rFonts w:eastAsiaTheme="majorEastAsia"/>
         </w:rPr>
@@ -5202,60 +4750,1564 @@
           <w:rFonts w:eastAsiaTheme="majorEastAsia"/>
           <w:b/>
           <w:bCs/>
-        </w:rPr>
-        <w:t>XML</w:t>
-      </w:r>
-      <w:r>
-        <w:rPr>
-          <w:rFonts w:eastAsiaTheme="majorEastAsia"/>
-        </w:rPr>
-        <w:t xml:space="preserve"> (</w:t>
-      </w:r>
-      <w:proofErr w:type="spellStart"/>
-      <w:r>
-        <w:rPr>
-          <w:rFonts w:eastAsiaTheme="majorEastAsia"/>
-        </w:rPr>
-        <w:t>eXtensible</w:t>
-      </w:r>
-      <w:proofErr w:type="spellEnd"/>
-      <w:r>
-        <w:rPr>
-          <w:rFonts w:eastAsiaTheme="majorEastAsia"/>
-        </w:rPr>
-        <w:t xml:space="preserve"> </w:t>
-      </w:r>
-      <w:proofErr w:type="spellStart"/>
-      <w:r>
-        <w:rPr>
-          <w:rFonts w:eastAsiaTheme="majorEastAsia"/>
-        </w:rPr>
-        <w:t>Markup</w:t>
-      </w:r>
-      <w:proofErr w:type="spellEnd"/>
-      <w:r>
-        <w:rPr>
-          <w:rFonts w:eastAsiaTheme="majorEastAsia"/>
-        </w:rPr>
-        <w:t xml:space="preserve"> </w:t>
-      </w:r>
-      <w:proofErr w:type="spellStart"/>
-      <w:r>
-        <w:rPr>
-          <w:rFonts w:eastAsiaTheme="majorEastAsia"/>
-        </w:rPr>
-        <w:t>Language</w:t>
-      </w:r>
-      <w:proofErr w:type="spellEnd"/>
-      <w:r>
-        <w:rPr>
-          <w:rFonts w:eastAsiaTheme="majorEastAsia"/>
-        </w:rPr>
-        <w:t>) je značkovací jazyk určený pro strukturované ukládání a přenos dat. Umožňuje definovat vlastní tagy a hierarchickou strukturu, což usnadňuje formátování, sdílení a interpretaci dat mezi různými systémy.</w:t>
+          <w:i/>
+          <w:iCs/>
+        </w:rPr>
+        <w:t>MySQL</w:t>
+      </w:r>
+      <w:r>
+        <w:rPr>
+          <w:rFonts w:eastAsiaTheme="majorEastAsia"/>
+        </w:rPr>
+        <w:t xml:space="preserve"> je relační databázový systém pro ukládání a správu dat. Je známý svou spolehlivostí, robustností i vysokým výkonem. V aplikaci slouží k uložení a správě dat, jako jsou informace o testech, promptech, uživatelích, </w:t>
+      </w:r>
+      <w:r>
+        <w:rPr>
+          <w:rFonts w:eastAsiaTheme="majorEastAsia"/>
+        </w:rPr>
+        <w:t>předmětech</w:t>
+      </w:r>
+      <w:r>
+        <w:rPr>
+          <w:rFonts w:eastAsiaTheme="majorEastAsia"/>
+        </w:rPr>
+        <w:t xml:space="preserve"> i dalších entitách.</w:t>
+      </w:r>
+      <w:r>
+        <w:rPr>
+          <w:rFonts w:eastAsiaTheme="majorEastAsia"/>
+        </w:rPr>
+        <w:t xml:space="preserve"> Dopodrobna bude databáze popsána níže v této dokumentaci.</w:t>
       </w:r>
     </w:p>
     <w:p>
       <w:pPr>
+        <w:ind w:firstLine="576"/>
+        <w:rPr>
+          <w:rFonts w:eastAsiaTheme="majorEastAsia"/>
+        </w:rPr>
+      </w:pPr>
+      <w:proofErr w:type="spellStart"/>
+      <w:r>
+        <w:rPr>
+          <w:rFonts w:eastAsiaTheme="majorEastAsia"/>
+          <w:b/>
+          <w:bCs/>
+          <w:i/>
+          <w:iCs/>
+        </w:rPr>
+        <w:t>MySQL</w:t>
+      </w:r>
+      <w:proofErr w:type="spellEnd"/>
+      <w:r>
+        <w:rPr>
+          <w:rFonts w:eastAsiaTheme="majorEastAsia"/>
+          <w:b/>
+          <w:bCs/>
+        </w:rPr>
+        <w:t xml:space="preserve"> </w:t>
+      </w:r>
+      <w:proofErr w:type="spellStart"/>
+      <w:r>
+        <w:rPr>
+          <w:rFonts w:eastAsiaTheme="majorEastAsia"/>
+          <w:b/>
+          <w:bCs/>
+          <w:i/>
+          <w:iCs/>
+        </w:rPr>
+        <w:t>Workbench</w:t>
+      </w:r>
+      <w:proofErr w:type="spellEnd"/>
+      <w:r>
+        <w:rPr>
+          <w:rFonts w:eastAsiaTheme="majorEastAsia"/>
+        </w:rPr>
+        <w:t xml:space="preserve">, který využívám pro usnadnění práce s databází, je </w:t>
+      </w:r>
+      <w:r>
+        <w:rPr>
+          <w:rFonts w:eastAsiaTheme="majorEastAsia"/>
+        </w:rPr>
+        <w:t xml:space="preserve">pokročilé grafické uživatelské rozhraní, které umožňuje vizuální návrh databáze, správu a ladění </w:t>
+      </w:r>
+      <w:r>
+        <w:rPr>
+          <w:rFonts w:eastAsiaTheme="majorEastAsia"/>
+          <w:i/>
+          <w:iCs/>
+        </w:rPr>
+        <w:t>SQL</w:t>
+      </w:r>
+      <w:r>
+        <w:rPr>
+          <w:rFonts w:eastAsiaTheme="majorEastAsia"/>
+        </w:rPr>
+        <w:t xml:space="preserve"> dotazů, monitorování výkonu a celkovou správu databázového systému.</w:t>
+      </w:r>
+    </w:p>
+    <w:p>
+      <w:pPr>
+        <w:ind w:firstLine="576"/>
+        <w:rPr>
+          <w:rFonts w:eastAsiaTheme="majorEastAsia"/>
+        </w:rPr>
+      </w:pPr>
+      <w:r>
+        <w:rPr>
+          <w:rFonts w:eastAsiaTheme="majorEastAsia"/>
+          <w:b/>
+          <w:bCs/>
+          <w:i/>
+          <w:iCs/>
+        </w:rPr>
+        <w:t>XAMPP</w:t>
+      </w:r>
+      <w:r>
+        <w:rPr>
+          <w:rFonts w:eastAsiaTheme="majorEastAsia"/>
+        </w:rPr>
+        <w:t xml:space="preserve">, který využívám pro práci se serverem </w:t>
+      </w:r>
+      <w:proofErr w:type="spellStart"/>
+      <w:r>
+        <w:rPr>
+          <w:rFonts w:eastAsiaTheme="majorEastAsia"/>
+          <w:i/>
+          <w:iCs/>
+        </w:rPr>
+        <w:t>MySQL</w:t>
+      </w:r>
+      <w:proofErr w:type="spellEnd"/>
+      <w:r>
+        <w:rPr>
+          <w:rFonts w:eastAsiaTheme="majorEastAsia"/>
+        </w:rPr>
+        <w:t xml:space="preserve">, je balíček softwarových nástrojů určených pro lokální vývoj a testování webových aplikací. </w:t>
+      </w:r>
+      <w:r>
+        <w:rPr>
+          <w:rFonts w:eastAsiaTheme="majorEastAsia"/>
+          <w:i/>
+          <w:iCs/>
+        </w:rPr>
+        <w:t>XAMPP</w:t>
+      </w:r>
+      <w:r>
+        <w:rPr>
+          <w:rFonts w:eastAsiaTheme="majorEastAsia"/>
+        </w:rPr>
+        <w:t xml:space="preserve"> obsahuje </w:t>
+      </w:r>
+      <w:proofErr w:type="spellStart"/>
+      <w:r>
+        <w:rPr>
+          <w:rFonts w:eastAsiaTheme="majorEastAsia"/>
+          <w:i/>
+          <w:iCs/>
+        </w:rPr>
+        <w:t>Apache</w:t>
+      </w:r>
+      <w:proofErr w:type="spellEnd"/>
+      <w:r>
+        <w:rPr>
+          <w:rFonts w:eastAsiaTheme="majorEastAsia"/>
+        </w:rPr>
+        <w:t xml:space="preserve">, </w:t>
+      </w:r>
+      <w:proofErr w:type="spellStart"/>
+      <w:r>
+        <w:rPr>
+          <w:rFonts w:eastAsiaTheme="majorEastAsia"/>
+          <w:i/>
+          <w:iCs/>
+        </w:rPr>
+        <w:t>MySQL</w:t>
+      </w:r>
+      <w:proofErr w:type="spellEnd"/>
+      <w:r>
+        <w:rPr>
+          <w:rFonts w:eastAsiaTheme="majorEastAsia"/>
+        </w:rPr>
+        <w:t xml:space="preserve">, </w:t>
+      </w:r>
+      <w:r>
+        <w:rPr>
+          <w:rFonts w:eastAsiaTheme="majorEastAsia"/>
+          <w:i/>
+          <w:iCs/>
+        </w:rPr>
+        <w:t>PHP</w:t>
+      </w:r>
+      <w:r>
+        <w:rPr>
+          <w:rFonts w:eastAsiaTheme="majorEastAsia"/>
+        </w:rPr>
+        <w:t xml:space="preserve"> a </w:t>
+      </w:r>
+      <w:r>
+        <w:rPr>
+          <w:rFonts w:eastAsiaTheme="majorEastAsia"/>
+          <w:i/>
+          <w:iCs/>
+        </w:rPr>
+        <w:t>Perl</w:t>
+      </w:r>
+      <w:r>
+        <w:rPr>
+          <w:rFonts w:eastAsiaTheme="majorEastAsia"/>
+        </w:rPr>
+        <w:t>, a díky svému jednoduchému nastavení umožňuje rychle nasadit a spravovat databázový server v lokálním prostředí.</w:t>
+      </w:r>
+    </w:p>
+    <w:p>
+      <w:pPr>
+        <w:pStyle w:val="Nadpis2"/>
+      </w:pPr>
+      <w:bookmarkStart w:id="23" w:name="_Toc191402524"/>
+      <w:r>
+        <w:t>Tvorba</w:t>
+      </w:r>
+      <w:r>
+        <w:t xml:space="preserve"> uživatelského rozhraní</w:t>
+      </w:r>
+      <w:bookmarkEnd w:id="23"/>
+    </w:p>
+    <w:p>
+      <w:pPr>
+        <w:ind w:firstLine="432"/>
+        <w:rPr>
+          <w:rFonts w:eastAsiaTheme="majorEastAsia"/>
+        </w:rPr>
+      </w:pPr>
+      <w:proofErr w:type="spellStart"/>
+      <w:r>
+        <w:rPr>
+          <w:rFonts w:eastAsiaTheme="majorEastAsia"/>
+          <w:b/>
+          <w:bCs/>
+          <w:i/>
+          <w:iCs/>
+        </w:rPr>
+        <w:t>JavaFX</w:t>
+      </w:r>
+      <w:proofErr w:type="spellEnd"/>
+      <w:r>
+        <w:rPr>
+          <w:rFonts w:eastAsiaTheme="majorEastAsia"/>
+        </w:rPr>
+        <w:t xml:space="preserve"> je moderní platforma pro tvorbu uživatelských rozhraní v Javě. Podporuje práci s grafikou, multimédii a animacemi a je</w:t>
+      </w:r>
+      <w:r>
+        <w:rPr>
+          <w:rFonts w:eastAsiaTheme="majorEastAsia"/>
+        </w:rPr>
+        <w:t xml:space="preserve"> často</w:t>
+      </w:r>
+      <w:r>
+        <w:rPr>
+          <w:rFonts w:eastAsiaTheme="majorEastAsia"/>
+        </w:rPr>
+        <w:t xml:space="preserve"> základem pro desktopové aplikace.</w:t>
+      </w:r>
+    </w:p>
+    <w:p>
+      <w:pPr>
+        <w:ind w:firstLine="432"/>
+        <w:rPr>
+          <w:rFonts w:eastAsiaTheme="majorEastAsia"/>
+        </w:rPr>
+      </w:pPr>
+      <w:r>
+        <w:rPr>
+          <w:rFonts w:eastAsiaTheme="majorEastAsia"/>
+          <w:b/>
+          <w:bCs/>
+          <w:i/>
+          <w:iCs/>
+        </w:rPr>
+        <w:t>FXML</w:t>
+      </w:r>
+      <w:r>
+        <w:rPr>
+          <w:rFonts w:eastAsiaTheme="majorEastAsia"/>
+        </w:rPr>
+        <w:t xml:space="preserve"> je deklarativní jazyk</w:t>
+      </w:r>
+      <w:r>
+        <w:rPr>
+          <w:rFonts w:eastAsiaTheme="majorEastAsia"/>
+        </w:rPr>
+        <w:t xml:space="preserve"> založený na </w:t>
+      </w:r>
+      <w:r>
+        <w:rPr>
+          <w:rFonts w:eastAsiaTheme="majorEastAsia"/>
+          <w:i/>
+          <w:iCs/>
+        </w:rPr>
+        <w:t>XML</w:t>
+      </w:r>
+      <w:r>
+        <w:rPr>
+          <w:rFonts w:eastAsiaTheme="majorEastAsia"/>
+        </w:rPr>
+        <w:t xml:space="preserve"> pro popis grafického uživatelského rozhraní v </w:t>
+      </w:r>
+      <w:proofErr w:type="spellStart"/>
+      <w:r>
+        <w:rPr>
+          <w:rFonts w:eastAsiaTheme="majorEastAsia"/>
+          <w:i/>
+          <w:iCs/>
+        </w:rPr>
+        <w:t>JavaFX</w:t>
+      </w:r>
+      <w:proofErr w:type="spellEnd"/>
+      <w:r>
+        <w:rPr>
+          <w:rFonts w:eastAsiaTheme="majorEastAsia"/>
+        </w:rPr>
+        <w:t xml:space="preserve">. Umožňuje oddělit design </w:t>
+      </w:r>
+      <w:r>
+        <w:rPr>
+          <w:rFonts w:eastAsiaTheme="majorEastAsia"/>
+          <w:i/>
+          <w:iCs/>
+        </w:rPr>
+        <w:t>UI</w:t>
+      </w:r>
+      <w:r>
+        <w:rPr>
+          <w:rFonts w:eastAsiaTheme="majorEastAsia"/>
+        </w:rPr>
+        <w:t xml:space="preserve"> od aplikační logiky, což přispívá k lepší udržovatelnosti a přehlednosti kódu.</w:t>
+      </w:r>
+    </w:p>
+    <w:p>
+      <w:pPr>
+        <w:ind w:firstLine="432"/>
+        <w:rPr>
+          <w:rFonts w:eastAsiaTheme="majorEastAsia"/>
+        </w:rPr>
+      </w:pPr>
+      <w:proofErr w:type="spellStart"/>
+      <w:r>
+        <w:rPr>
+          <w:b/>
+          <w:bCs/>
+          <w:i/>
+          <w:iCs/>
+        </w:rPr>
+        <w:lastRenderedPageBreak/>
+        <w:t>JavaFX</w:t>
+      </w:r>
+      <w:proofErr w:type="spellEnd"/>
+      <w:r>
+        <w:rPr>
+          <w:b/>
+          <w:bCs/>
+        </w:rPr>
+        <w:t xml:space="preserve"> </w:t>
+      </w:r>
+      <w:proofErr w:type="spellStart"/>
+      <w:r>
+        <w:rPr>
+          <w:b/>
+          <w:bCs/>
+          <w:i/>
+          <w:iCs/>
+        </w:rPr>
+        <w:t>Maven</w:t>
+      </w:r>
+      <w:proofErr w:type="spellEnd"/>
+      <w:r>
+        <w:rPr>
+          <w:b/>
+          <w:bCs/>
+        </w:rPr>
+        <w:t xml:space="preserve"> </w:t>
+      </w:r>
+      <w:r>
+        <w:rPr>
+          <w:b/>
+          <w:bCs/>
+          <w:i/>
+          <w:iCs/>
+        </w:rPr>
+        <w:t>Plugin</w:t>
+      </w:r>
+      <w:r>
+        <w:t xml:space="preserve"> usnadňuje správu a spouštění </w:t>
+      </w:r>
+      <w:proofErr w:type="spellStart"/>
+      <w:r>
+        <w:t>JavaFX</w:t>
+      </w:r>
+      <w:proofErr w:type="spellEnd"/>
+      <w:r>
+        <w:t xml:space="preserve"> aplikací pomocí </w:t>
+      </w:r>
+      <w:proofErr w:type="spellStart"/>
+      <w:r>
+        <w:t>Apache</w:t>
+      </w:r>
+      <w:proofErr w:type="spellEnd"/>
+      <w:r>
+        <w:t xml:space="preserve"> </w:t>
+      </w:r>
+      <w:proofErr w:type="spellStart"/>
+      <w:r>
+        <w:t>Maven</w:t>
+      </w:r>
+      <w:proofErr w:type="spellEnd"/>
+      <w:r>
+        <w:t xml:space="preserve">. Plugin integruje spouštěcí mechanismus </w:t>
+      </w:r>
+      <w:proofErr w:type="spellStart"/>
+      <w:r>
+        <w:t>JavaFX</w:t>
+      </w:r>
+      <w:proofErr w:type="spellEnd"/>
+      <w:r>
+        <w:t xml:space="preserve"> do </w:t>
+      </w:r>
+      <w:proofErr w:type="spellStart"/>
+      <w:r>
+        <w:t>Maven</w:t>
+      </w:r>
+      <w:proofErr w:type="spellEnd"/>
+      <w:r>
+        <w:t xml:space="preserve"> build procesu, což umožňuje snadné spouštění a balení aplikace</w:t>
+      </w:r>
+      <w:r>
+        <w:t>.</w:t>
+      </w:r>
+    </w:p>
+    <w:p>
+      <w:pPr>
+        <w:ind w:firstLine="432"/>
+        <w:rPr>
+          <w:rFonts w:eastAsiaTheme="majorEastAsia"/>
+        </w:rPr>
+      </w:pPr>
+      <w:r>
+        <w:rPr>
+          <w:rFonts w:eastAsiaTheme="majorEastAsia"/>
+          <w:b/>
+          <w:bCs/>
+          <w:i/>
+          <w:iCs/>
+        </w:rPr>
+        <w:t>CSS</w:t>
+      </w:r>
+      <w:r>
+        <w:rPr>
+          <w:rFonts w:eastAsiaTheme="majorEastAsia"/>
+        </w:rPr>
+        <w:t xml:space="preserve"> (</w:t>
+      </w:r>
+      <w:proofErr w:type="spellStart"/>
+      <w:r>
+        <w:rPr>
+          <w:rFonts w:eastAsiaTheme="majorEastAsia"/>
+        </w:rPr>
+        <w:t>Cascading</w:t>
+      </w:r>
+      <w:proofErr w:type="spellEnd"/>
+      <w:r>
+        <w:rPr>
+          <w:rFonts w:eastAsiaTheme="majorEastAsia"/>
+        </w:rPr>
+        <w:t xml:space="preserve"> Style </w:t>
+      </w:r>
+      <w:proofErr w:type="spellStart"/>
+      <w:r>
+        <w:rPr>
+          <w:rFonts w:eastAsiaTheme="majorEastAsia"/>
+        </w:rPr>
+        <w:t>Sheets</w:t>
+      </w:r>
+      <w:proofErr w:type="spellEnd"/>
+      <w:r>
+        <w:rPr>
+          <w:rFonts w:eastAsiaTheme="majorEastAsia"/>
+        </w:rPr>
+        <w:t xml:space="preserve">) v kontextu </w:t>
+      </w:r>
+      <w:proofErr w:type="spellStart"/>
+      <w:r>
+        <w:rPr>
+          <w:rFonts w:eastAsiaTheme="majorEastAsia"/>
+        </w:rPr>
+        <w:t>JavaFX</w:t>
+      </w:r>
+      <w:proofErr w:type="spellEnd"/>
+      <w:r>
+        <w:rPr>
+          <w:rFonts w:eastAsiaTheme="majorEastAsia"/>
+        </w:rPr>
+        <w:t xml:space="preserve"> se od standardního CSS liší především tím, že je speciálně optimalizované pro stylování grafických komponent (Node) v prostředí </w:t>
+      </w:r>
+      <w:proofErr w:type="spellStart"/>
+      <w:r>
+        <w:rPr>
+          <w:rFonts w:eastAsiaTheme="majorEastAsia"/>
+        </w:rPr>
+        <w:t>JavaFX</w:t>
+      </w:r>
+      <w:proofErr w:type="spellEnd"/>
+      <w:r>
+        <w:rPr>
+          <w:rFonts w:eastAsiaTheme="majorEastAsia"/>
+        </w:rPr>
+        <w:t xml:space="preserve">. Zatímco standardní CSS se primárně používá pro webové stránky a má předdefinovaný soubor vlastností pro HTML elementy, CSS pro </w:t>
+      </w:r>
+      <w:proofErr w:type="spellStart"/>
+      <w:r>
+        <w:rPr>
+          <w:rFonts w:eastAsiaTheme="majorEastAsia"/>
+        </w:rPr>
+        <w:t>JavaFX</w:t>
+      </w:r>
+      <w:proofErr w:type="spellEnd"/>
+      <w:r>
+        <w:rPr>
+          <w:rFonts w:eastAsiaTheme="majorEastAsia"/>
+        </w:rPr>
+        <w:t xml:space="preserve"> obsahuje rozšířenou sadu vlastností, které odpovídají specifickým atributům a vlastnostem </w:t>
+      </w:r>
+      <w:proofErr w:type="spellStart"/>
+      <w:r>
+        <w:rPr>
+          <w:rFonts w:eastAsiaTheme="majorEastAsia"/>
+        </w:rPr>
+        <w:t>JavaFX</w:t>
+      </w:r>
+      <w:proofErr w:type="spellEnd"/>
+      <w:r>
+        <w:rPr>
+          <w:rFonts w:eastAsiaTheme="majorEastAsia"/>
+        </w:rPr>
+        <w:t xml:space="preserve"> ovládacích prvků.</w:t>
+      </w:r>
+    </w:p>
+    <w:p>
+      <w:pPr>
+        <w:ind w:firstLine="432"/>
+        <w:rPr>
+          <w:rFonts w:eastAsiaTheme="majorEastAsia"/>
+        </w:rPr>
+      </w:pPr>
+      <w:r>
+        <w:rPr>
+          <w:rFonts w:eastAsiaTheme="majorEastAsia"/>
+        </w:rPr>
+        <w:t>S</w:t>
+      </w:r>
+      <w:r>
+        <w:rPr>
+          <w:rFonts w:eastAsiaTheme="majorEastAsia"/>
+        </w:rPr>
+        <w:t xml:space="preserve">truktura a syntaxe </w:t>
+      </w:r>
+      <w:r>
+        <w:rPr>
+          <w:rFonts w:eastAsiaTheme="majorEastAsia"/>
+        </w:rPr>
+        <w:t>je tedy</w:t>
+      </w:r>
+      <w:r>
+        <w:rPr>
+          <w:rFonts w:eastAsiaTheme="majorEastAsia"/>
+        </w:rPr>
+        <w:t xml:space="preserve"> mírně </w:t>
+      </w:r>
+      <w:r>
+        <w:rPr>
+          <w:rFonts w:eastAsiaTheme="majorEastAsia"/>
+        </w:rPr>
+        <w:t>jiná</w:t>
+      </w:r>
+      <w:r>
+        <w:rPr>
+          <w:rFonts w:eastAsiaTheme="majorEastAsia"/>
+        </w:rPr>
+        <w:t xml:space="preserve">, aby efektivně pracovala s hierarchií uzlů v </w:t>
+      </w:r>
+      <w:proofErr w:type="spellStart"/>
+      <w:r>
+        <w:rPr>
+          <w:rFonts w:eastAsiaTheme="majorEastAsia"/>
+        </w:rPr>
+        <w:t>JavaFX</w:t>
+      </w:r>
+      <w:proofErr w:type="spellEnd"/>
+      <w:r>
+        <w:rPr>
+          <w:rFonts w:eastAsiaTheme="majorEastAsia"/>
+        </w:rPr>
+        <w:t xml:space="preserve"> scéně, což umožňuje detailní a flexibilní úpravu vzhledu desktopových aplikací postavených na této platformě.</w:t>
+      </w:r>
+    </w:p>
+    <w:p>
+      <w:pPr>
+        <w:pStyle w:val="Nadpis2"/>
+      </w:pPr>
+      <w:bookmarkStart w:id="24" w:name="_Toc191402525"/>
+      <w:r>
+        <w:t>Ostatní knihovny</w:t>
+      </w:r>
+      <w:bookmarkEnd w:id="24"/>
+    </w:p>
+    <w:p>
+      <w:pPr>
+        <w:ind w:firstLine="578"/>
+      </w:pPr>
+      <w:proofErr w:type="spellStart"/>
+      <w:r>
+        <w:rPr>
+          <w:b/>
+          <w:bCs/>
+          <w:i/>
+          <w:iCs/>
+        </w:rPr>
+        <w:t>Gson</w:t>
+      </w:r>
+      <w:proofErr w:type="spellEnd"/>
+      <w:r>
+        <w:t xml:space="preserve"> </w:t>
+      </w:r>
+      <w:r>
+        <w:t>(</w:t>
+      </w:r>
+      <w:proofErr w:type="spellStart"/>
+      <w:r>
+        <w:rPr>
+          <w:rStyle w:val="KdChar"/>
+        </w:rPr>
+        <w:t>com.google.code.gson</w:t>
+      </w:r>
+      <w:proofErr w:type="spellEnd"/>
+      <w:r>
+        <w:t xml:space="preserve">) je knihovna od společnosti Google pro </w:t>
+      </w:r>
+      <w:proofErr w:type="spellStart"/>
+      <w:r>
+        <w:t>parsování</w:t>
+      </w:r>
+      <w:proofErr w:type="spellEnd"/>
+      <w:r>
+        <w:t xml:space="preserve"> </w:t>
+      </w:r>
+      <w:r>
+        <w:t>Java objektů do formátu JSON a naopak. Umožňuje snadnou konverzi dat mezi Java objekty a jejich reprezentací ve formátu JSON, což je využíváno v komunikaci s API a další manipulaci s daty.</w:t>
+      </w:r>
+    </w:p>
+    <w:p>
+      <w:pPr>
+        <w:ind w:firstLine="578"/>
+      </w:pPr>
+      <w:proofErr w:type="spellStart"/>
+      <w:r>
+        <w:rPr>
+          <w:b/>
+          <w:bCs/>
+          <w:i/>
+          <w:iCs/>
+        </w:rPr>
+        <w:t>Dotenv</w:t>
+      </w:r>
+      <w:proofErr w:type="spellEnd"/>
+      <w:r>
+        <w:t xml:space="preserve"> </w:t>
+      </w:r>
+      <w:r>
+        <w:t>(</w:t>
+      </w:r>
+      <w:proofErr w:type="spellStart"/>
+      <w:r>
+        <w:rPr>
+          <w:rStyle w:val="KdChar"/>
+        </w:rPr>
+        <w:t>io.github.cdimascio.dotenv-java</w:t>
+      </w:r>
+      <w:proofErr w:type="spellEnd"/>
+      <w:r>
+        <w:t>) je knihovna umožňující načítání konfiguračních proměnných z prostředí (</w:t>
+      </w:r>
+      <w:r>
+        <w:rPr>
+          <w:rStyle w:val="KdChar"/>
+        </w:rPr>
+        <w:t>.</w:t>
+      </w:r>
+      <w:proofErr w:type="spellStart"/>
+      <w:r>
+        <w:rPr>
+          <w:rStyle w:val="KdChar"/>
+        </w:rPr>
+        <w:t>env</w:t>
+      </w:r>
+      <w:proofErr w:type="spellEnd"/>
+      <w:r>
+        <w:t xml:space="preserve"> souboru). To usnadňuje správu citlivých informací a konfigurací bez nutnosti </w:t>
+      </w:r>
+      <w:proofErr w:type="spellStart"/>
+      <w:r>
+        <w:t>hardcodovat</w:t>
+      </w:r>
+      <w:proofErr w:type="spellEnd"/>
+      <w:r>
+        <w:t xml:space="preserve"> je přímo v kódu. </w:t>
+      </w:r>
+    </w:p>
+    <w:p>
+      <w:pPr>
+        <w:ind w:firstLine="578"/>
+      </w:pPr>
+      <w:proofErr w:type="spellStart"/>
+      <w:r>
+        <w:rPr>
+          <w:b/>
+          <w:bCs/>
+          <w:i/>
+          <w:iCs/>
+        </w:rPr>
+        <w:t>Apache</w:t>
+      </w:r>
+      <w:proofErr w:type="spellEnd"/>
+      <w:r>
+        <w:rPr>
+          <w:b/>
+          <w:bCs/>
+          <w:i/>
+          <w:iCs/>
+        </w:rPr>
+        <w:t xml:space="preserve"> POI</w:t>
+      </w:r>
+      <w:r>
+        <w:rPr>
+          <w:i/>
+          <w:iCs/>
+        </w:rPr>
+        <w:t xml:space="preserve"> </w:t>
+      </w:r>
+      <w:r>
+        <w:t>(</w:t>
+      </w:r>
+      <w:proofErr w:type="spellStart"/>
+      <w:r>
+        <w:rPr>
+          <w:rStyle w:val="KdChar"/>
+        </w:rPr>
+        <w:t>org.apache.poi.xwpf.usermodel</w:t>
+      </w:r>
+      <w:proofErr w:type="spellEnd"/>
+      <w:r>
+        <w:t>)</w:t>
+      </w:r>
+      <w:r>
+        <w:t xml:space="preserve"> je knihovna, která umožňuje vytvářet a manipulovat s dokumenty ve formátech Microsoft Office. V projektu je využívána ke generování testů ve formátu </w:t>
+      </w:r>
+      <w:r>
+        <w:t>*.docx</w:t>
+      </w:r>
+      <w:r>
+        <w:t>, přičemž umožňuje dynamické vytváření dokumentů s formátovaným textem a dalšími prvky.</w:t>
+      </w:r>
+    </w:p>
+    <w:p>
+      <w:r>
+        <w:br w:type="page"/>
+      </w:r>
+    </w:p>
+    <w:p>
+      <w:pPr>
+        <w:pStyle w:val="Nadpis1"/>
+      </w:pPr>
+      <w:bookmarkStart w:id="25" w:name="_Toc191402526"/>
+      <w:r>
+        <w:lastRenderedPageBreak/>
+        <w:t>Struktura databáze</w:t>
+      </w:r>
+      <w:bookmarkEnd w:id="25"/>
+    </w:p>
+    <w:p>
+      <w:r>
+        <w:tab/>
+      </w:r>
+      <w:r>
+        <w:t>Než</w:t>
+      </w:r>
+      <w:r>
+        <w:t xml:space="preserve"> rozeberu souborovou strukturu, funkčnosti, třídy, jejich metody a konkrétní ukázky kódů aplikace, představím samotnou databázi, na které celá aplikace stojí a bez které by neměla šanci správně fungovat.</w:t>
+      </w:r>
+      <w:r>
+        <w:rPr>
+          <w:noProof/>
+          <w14:ligatures w14:val="standardContextual"/>
+        </w:rPr>
+        <w:t xml:space="preserve"> </w:t>
+      </w:r>
+    </w:p>
+    <w:p>
+      <w:pPr>
+        <w:pStyle w:val="Nadpis2"/>
+      </w:pPr>
+      <w:r>
+        <w:t xml:space="preserve">E-R </w:t>
+      </w:r>
+      <w:r>
+        <w:t>model</w:t>
+      </w:r>
+    </w:p>
+    <w:p>
+      <w:pPr>
+        <w:ind w:firstLine="578"/>
+      </w:pPr>
+      <w:r>
+        <w:rPr>
+          <w:i/>
+          <w:iCs/>
+        </w:rPr>
+        <w:t>E-R model</w:t>
+      </w:r>
+      <w:r>
+        <w:t xml:space="preserve"> přikládám, protože slouží jako klíčový nástroj při návrhu databáze. Umožňuje vizuálně definovat strukturu dat, což usnadňuje analýzu, optimalizaci a komunikaci mezi vývojáři. Díky </w:t>
+      </w:r>
+      <w:r>
+        <w:rPr>
+          <w:i/>
+          <w:iCs/>
+        </w:rPr>
+        <w:t>E-R modelu</w:t>
+      </w:r>
+      <w:r>
+        <w:t xml:space="preserve"> lze jednoznačně identifikovat entity, jejich atributy a vztahy mezi nimi, což přispívá ke správnému návrhu a implementaci relační databáze, na které aplikace stojí.</w:t>
+      </w:r>
+    </w:p>
+    <w:p>
+      <w:pPr>
+        <w:ind w:firstLine="578"/>
+      </w:pPr>
+      <w:r>
+        <w:t xml:space="preserve">Nutno je podotknout, že E-R model jsem vygeneroval pomocí funkce </w:t>
+      </w:r>
+      <w:r>
+        <w:rPr>
+          <w:i/>
+          <w:iCs/>
+        </w:rPr>
+        <w:t xml:space="preserve">Reverse </w:t>
+      </w:r>
+      <w:proofErr w:type="spellStart"/>
+      <w:r>
+        <w:rPr>
+          <w:i/>
+          <w:iCs/>
+        </w:rPr>
+        <w:t>engineer</w:t>
+      </w:r>
+      <w:proofErr w:type="spellEnd"/>
+      <w:r>
+        <w:t xml:space="preserve"> v </w:t>
+      </w:r>
+      <w:proofErr w:type="spellStart"/>
+      <w:r>
+        <w:rPr>
+          <w:i/>
+          <w:iCs/>
+        </w:rPr>
+        <w:t>MySQL</w:t>
+      </w:r>
+      <w:proofErr w:type="spellEnd"/>
+      <w:r>
+        <w:rPr>
+          <w:i/>
+          <w:iCs/>
+        </w:rPr>
+        <w:t xml:space="preserve"> </w:t>
+      </w:r>
+      <w:proofErr w:type="spellStart"/>
+      <w:r>
+        <w:rPr>
+          <w:i/>
+          <w:iCs/>
+        </w:rPr>
+        <w:t>Workbench</w:t>
+      </w:r>
+      <w:proofErr w:type="spellEnd"/>
+      <w:r>
+        <w:t>. Jelikož tato funkce není stoprocentně dokonalá, E-R model není do detailu přesný. Pro naše účely však postačí.</w:t>
+      </w:r>
+    </w:p>
+    <w:p>
+      <w:pPr>
+        <w:keepNext/>
+      </w:pPr>
+      <w:r>
+        <w:drawing>
+          <wp:inline distT="0" distB="0" distL="0" distR="0" wp14:anchorId="18A228E8" wp14:editId="383EF912">
+            <wp:extent cx="5748655" cy="4495165"/>
+            <wp:effectExtent l="0" t="0" r="4445" b="635"/>
+            <wp:docPr id="43366702" name="Obrázek 1" descr="Obsah obrázku text, snímek obrazovky, Písmo, Paralelní&#10;&#10;Obsah vygenerovaný umělou inteligencí může být nesprávný."/>
+            <wp:cNvGraphicFramePr>
+              <a:graphicFrameLocks xmlns:a="http://schemas.openxmlformats.org/drawingml/2006/main" noChangeAspect="1"/>
+            </wp:cNvGraphicFramePr>
+            <a:graphic xmlns:a="http://schemas.openxmlformats.org/drawingml/2006/main">
+              <a:graphicData uri="http://schemas.openxmlformats.org/drawingml/2006/picture">
+                <pic:pic xmlns:pic="http://schemas.openxmlformats.org/drawingml/2006/picture">
+                  <pic:nvPicPr>
+                    <pic:cNvPr id="43366702" name="Obrázek 1" descr="Obsah obrázku text, snímek obrazovky, Písmo, Paralelní&#10;&#10;Obsah vygenerovaný umělou inteligencí může být nesprávný."/>
+                    <pic:cNvPicPr/>
+                  </pic:nvPicPr>
+                  <pic:blipFill>
+                    <a:blip r:embed="rId11">
+                      <a:extLst>
+                        <a:ext uri="{28A0092B-C50C-407E-A947-70E740481C1C}">
+                          <a14:useLocalDpi xmlns:a14="http://schemas.microsoft.com/office/drawing/2010/main" val="0"/>
+                        </a:ext>
+                      </a:extLst>
+                    </a:blip>
+                    <a:stretch>
+                      <a:fillRect/>
+                    </a:stretch>
+                  </pic:blipFill>
+                  <pic:spPr>
+                    <a:xfrm>
+                      <a:off x="0" y="0"/>
+                      <a:ext cx="5748655" cy="4495165"/>
+                    </a:xfrm>
+                    <a:prstGeom prst="rect">
+                      <a:avLst/>
+                    </a:prstGeom>
+                  </pic:spPr>
+                </pic:pic>
+              </a:graphicData>
+            </a:graphic>
+          </wp:inline>
+        </w:drawing>
+      </w:r>
+    </w:p>
+    <w:p>
+      <w:pPr>
+        <w:pStyle w:val="Titulek"/>
+      </w:pPr>
+      <w:r>
+        <w:t xml:space="preserve">Obrázek </w:t>
+      </w:r>
+      <w:r>
+        <w:fldChar w:fldCharType="begin"/>
+      </w:r>
+      <w:r>
+        <w:instrText xml:space="preserve"> SEQ Obrázek \* ARABIC </w:instrText>
+      </w:r>
+      <w:r>
+        <w:fldChar w:fldCharType="separate"/>
+      </w:r>
+      <w:r>
+        <w:rPr>
+          <w:noProof/>
+        </w:rPr>
+        <w:t>2</w:t>
+      </w:r>
+      <w:r>
+        <w:fldChar w:fldCharType="end"/>
+      </w:r>
+      <w:r>
+        <w:t>: E-R model databáze chatbot</w:t>
+      </w:r>
+    </w:p>
+    <w:p>
+      <w:pPr>
+        <w:spacing w:before="0" w:after="160" w:line="259" w:lineRule="auto"/>
+      </w:pPr>
+      <w:r>
+        <w:br w:type="page"/>
+      </w:r>
+    </w:p>
+    <w:p>
+      <w:pPr>
+        <w:pStyle w:val="Nadpis2"/>
+      </w:pPr>
+      <w:r>
+        <w:lastRenderedPageBreak/>
+        <w:t>Mapování a popis tabulek</w:t>
+      </w:r>
+    </w:p>
+    <w:p>
+      <w:pPr>
+        <w:pStyle w:val="Nadpis3"/>
+      </w:pPr>
+      <w:r>
+        <w:t xml:space="preserve">Tabulka </w:t>
+      </w:r>
+      <w:proofErr w:type="spellStart"/>
+      <w:r>
+        <w:rPr>
+          <w:rStyle w:val="KdvnadpisuChar"/>
+          <w:rFonts w:eastAsiaTheme="majorEastAsia"/>
+        </w:rPr>
+        <w:t>subjects</w:t>
+      </w:r>
+      <w:proofErr w:type="spellEnd"/>
+    </w:p>
+    <w:tbl>
+      <w:tblPr>
+        <w:tblStyle w:val="Svtltabulkasmkou1"/>
+        <w:tblW w:w="0" w:type="auto"/>
+        <w:tblLook w:val="04A0" w:firstRow="1" w:lastRow="0" w:firstColumn="1" w:lastColumn="0" w:noHBand="0" w:noVBand="1"/>
+      </w:tblPr>
+      <w:tblGrid>
+        <w:gridCol w:w="1865"/>
+        <w:gridCol w:w="1863"/>
+        <w:gridCol w:w="1864"/>
+        <w:gridCol w:w="1864"/>
+      </w:tblGrid>
+      <w:tr>
+        <w:trPr>
+          <w:cnfStyle w:val="100000000000" w:firstRow="1" w:lastRow="0" w:firstColumn="0" w:lastColumn="0" w:oddVBand="0" w:evenVBand="0" w:oddHBand="0" w:evenHBand="0" w:firstRowFirstColumn="0" w:firstRowLastColumn="0" w:lastRowFirstColumn="0" w:lastRowLastColumn="0"/>
+          <w:trHeight w:val="227"/>
+        </w:trPr>
+        <w:tc>
+          <w:tcPr>
+            <w:cnfStyle w:val="001000000000" w:firstRow="0" w:lastRow="0" w:firstColumn="1" w:lastColumn="0" w:oddVBand="0" w:evenVBand="0" w:oddHBand="0" w:evenHBand="0" w:firstRowFirstColumn="0" w:firstRowLastColumn="0" w:lastRowFirstColumn="0" w:lastRowLastColumn="0"/>
+            <w:tcW w:w="1865" w:type="dxa"/>
+          </w:tcPr>
+          <w:p>
+            <w:r>
+              <w:t>Atribut</w:t>
+            </w:r>
+          </w:p>
+        </w:tc>
+        <w:tc>
+          <w:tcPr>
+            <w:tcW w:w="1863" w:type="dxa"/>
+          </w:tcPr>
+          <w:p>
+            <w:pPr>
+              <w:cnfStyle w:val="100000000000" w:firstRow="1" w:lastRow="0" w:firstColumn="0" w:lastColumn="0" w:oddVBand="0" w:evenVBand="0" w:oddHBand="0" w:evenHBand="0" w:firstRowFirstColumn="0" w:firstRowLastColumn="0" w:lastRowFirstColumn="0" w:lastRowLastColumn="0"/>
+            </w:pPr>
+            <w:r>
+              <w:t>Datový typ</w:t>
+            </w:r>
+          </w:p>
+        </w:tc>
+        <w:tc>
+          <w:tcPr>
+            <w:tcW w:w="1864" w:type="dxa"/>
+          </w:tcPr>
+          <w:p>
+            <w:pPr>
+              <w:cnfStyle w:val="100000000000" w:firstRow="1" w:lastRow="0" w:firstColumn="0" w:lastColumn="0" w:oddVBand="0" w:evenVBand="0" w:oddHBand="0" w:evenHBand="0" w:firstRowFirstColumn="0" w:firstRowLastColumn="0" w:lastRowFirstColumn="0" w:lastRowLastColumn="0"/>
+            </w:pPr>
+            <w:r>
+              <w:t>Povinnost</w:t>
+            </w:r>
+          </w:p>
+        </w:tc>
+        <w:tc>
+          <w:tcPr>
+            <w:tcW w:w="1864" w:type="dxa"/>
+          </w:tcPr>
+          <w:p>
+            <w:pPr>
+              <w:cnfStyle w:val="100000000000" w:firstRow="1" w:lastRow="0" w:firstColumn="0" w:lastColumn="0" w:oddVBand="0" w:evenVBand="0" w:oddHBand="0" w:evenHBand="0" w:firstRowFirstColumn="0" w:firstRowLastColumn="0" w:lastRowFirstColumn="0" w:lastRowLastColumn="0"/>
+            </w:pPr>
+            <w:r>
+              <w:t>Typ klíče</w:t>
+            </w:r>
+          </w:p>
+        </w:tc>
+      </w:tr>
+      <w:tr>
+        <w:trPr>
+          <w:trHeight w:val="233"/>
+        </w:trPr>
+        <w:tc>
+          <w:tcPr>
+            <w:cnfStyle w:val="001000000000" w:firstRow="0" w:lastRow="0" w:firstColumn="1" w:lastColumn="0" w:oddVBand="0" w:evenVBand="0" w:oddHBand="0" w:evenHBand="0" w:firstRowFirstColumn="0" w:firstRowLastColumn="0" w:lastRowFirstColumn="0" w:lastRowLastColumn="0"/>
+            <w:tcW w:w="1865" w:type="dxa"/>
+          </w:tcPr>
+          <w:p>
+            <w:pPr>
+              <w:pStyle w:val="Kd"/>
+              <w:rPr>
+                <w:b w:val="0"/>
+                <w:bCs w:val="0"/>
+              </w:rPr>
+            </w:pPr>
+            <w:proofErr w:type="spellStart"/>
+            <w:r>
+              <w:rPr>
+                <w:b w:val="0"/>
+                <w:bCs w:val="0"/>
+              </w:rPr>
+              <w:t>subjectId</w:t>
+            </w:r>
+            <w:proofErr w:type="spellEnd"/>
+          </w:p>
+        </w:tc>
+        <w:tc>
+          <w:tcPr>
+            <w:tcW w:w="1863" w:type="dxa"/>
+          </w:tcPr>
+          <w:p>
+            <w:pPr>
+              <w:pStyle w:val="Kd"/>
+              <w:cnfStyle w:val="000000000000" w:firstRow="0" w:lastRow="0" w:firstColumn="0" w:lastColumn="0" w:oddVBand="0" w:evenVBand="0" w:oddHBand="0" w:evenHBand="0" w:firstRowFirstColumn="0" w:firstRowLastColumn="0" w:lastRowFirstColumn="0" w:lastRowLastColumn="0"/>
+            </w:pPr>
+            <w:r>
+              <w:t>INT</w:t>
+            </w:r>
+          </w:p>
+        </w:tc>
+        <w:tc>
+          <w:tcPr>
+            <w:tcW w:w="1864" w:type="dxa"/>
+          </w:tcPr>
+          <w:p>
+            <w:pPr>
+              <w:cnfStyle w:val="000000000000" w:firstRow="0" w:lastRow="0" w:firstColumn="0" w:lastColumn="0" w:oddVBand="0" w:evenVBand="0" w:oddHBand="0" w:evenHBand="0" w:firstRowFirstColumn="0" w:firstRowLastColumn="0" w:lastRowFirstColumn="0" w:lastRowLastColumn="0"/>
+            </w:pPr>
+            <w:r>
+              <w:t>Ano</w:t>
+            </w:r>
+          </w:p>
+        </w:tc>
+        <w:tc>
+          <w:tcPr>
+            <w:tcW w:w="1864" w:type="dxa"/>
+          </w:tcPr>
+          <w:p>
+            <w:pPr>
+              <w:cnfStyle w:val="000000000000" w:firstRow="0" w:lastRow="0" w:firstColumn="0" w:lastColumn="0" w:oddVBand="0" w:evenVBand="0" w:oddHBand="0" w:evenHBand="0" w:firstRowFirstColumn="0" w:firstRowLastColumn="0" w:lastRowFirstColumn="0" w:lastRowLastColumn="0"/>
+            </w:pPr>
+            <w:r>
+              <w:t>Primární</w:t>
+            </w:r>
+          </w:p>
+        </w:tc>
+      </w:tr>
+      <w:tr>
+        <w:trPr>
+          <w:trHeight w:val="222"/>
+        </w:trPr>
+        <w:tc>
+          <w:tcPr>
+            <w:cnfStyle w:val="001000000000" w:firstRow="0" w:lastRow="0" w:firstColumn="1" w:lastColumn="0" w:oddVBand="0" w:evenVBand="0" w:oddHBand="0" w:evenHBand="0" w:firstRowFirstColumn="0" w:firstRowLastColumn="0" w:lastRowFirstColumn="0" w:lastRowLastColumn="0"/>
+            <w:tcW w:w="1865" w:type="dxa"/>
+          </w:tcPr>
+          <w:p>
+            <w:pPr>
+              <w:pStyle w:val="Kd"/>
+              <w:rPr>
+                <w:b w:val="0"/>
+                <w:bCs w:val="0"/>
+              </w:rPr>
+            </w:pPr>
+            <w:proofErr w:type="spellStart"/>
+            <w:r>
+              <w:rPr>
+                <w:b w:val="0"/>
+                <w:bCs w:val="0"/>
+              </w:rPr>
+              <w:t>name</w:t>
+            </w:r>
+            <w:proofErr w:type="spellEnd"/>
+          </w:p>
+        </w:tc>
+        <w:tc>
+          <w:tcPr>
+            <w:tcW w:w="1863" w:type="dxa"/>
+          </w:tcPr>
+          <w:p>
+            <w:pPr>
+              <w:cnfStyle w:val="000000000000" w:firstRow="0" w:lastRow="0" w:firstColumn="0" w:lastColumn="0" w:oddVBand="0" w:evenVBand="0" w:oddHBand="0" w:evenHBand="0" w:firstRowFirstColumn="0" w:firstRowLastColumn="0" w:lastRowFirstColumn="0" w:lastRowLastColumn="0"/>
+            </w:pPr>
+          </w:p>
+        </w:tc>
+        <w:tc>
+          <w:tcPr>
+            <w:tcW w:w="1864" w:type="dxa"/>
+          </w:tcPr>
+          <w:p>
+            <w:pPr>
+              <w:cnfStyle w:val="000000000000" w:firstRow="0" w:lastRow="0" w:firstColumn="0" w:lastColumn="0" w:oddVBand="0" w:evenVBand="0" w:oddHBand="0" w:evenHBand="0" w:firstRowFirstColumn="0" w:firstRowLastColumn="0" w:lastRowFirstColumn="0" w:lastRowLastColumn="0"/>
+            </w:pPr>
+            <w:r>
+              <w:t>Ano</w:t>
+            </w:r>
+          </w:p>
+        </w:tc>
+        <w:tc>
+          <w:tcPr>
+            <w:tcW w:w="1864" w:type="dxa"/>
+          </w:tcPr>
+          <w:p>
+            <w:pPr>
+              <w:cnfStyle w:val="000000000000" w:firstRow="0" w:lastRow="0" w:firstColumn="0" w:lastColumn="0" w:oddVBand="0" w:evenVBand="0" w:oddHBand="0" w:evenHBand="0" w:firstRowFirstColumn="0" w:firstRowLastColumn="0" w:lastRowFirstColumn="0" w:lastRowLastColumn="0"/>
+            </w:pPr>
+          </w:p>
+        </w:tc>
+      </w:tr>
+      <w:tr>
+        <w:trPr>
+          <w:trHeight w:val="227"/>
+        </w:trPr>
+        <w:tc>
+          <w:tcPr>
+            <w:cnfStyle w:val="001000000000" w:firstRow="0" w:lastRow="0" w:firstColumn="1" w:lastColumn="0" w:oddVBand="0" w:evenVBand="0" w:oddHBand="0" w:evenHBand="0" w:firstRowFirstColumn="0" w:firstRowLastColumn="0" w:lastRowFirstColumn="0" w:lastRowLastColumn="0"/>
+            <w:tcW w:w="1865" w:type="dxa"/>
+          </w:tcPr>
+          <w:p>
+            <w:pPr>
+              <w:pStyle w:val="Kd"/>
+              <w:rPr>
+                <w:b w:val="0"/>
+                <w:bCs w:val="0"/>
+              </w:rPr>
+            </w:pPr>
+            <w:proofErr w:type="spellStart"/>
+            <w:r>
+              <w:rPr>
+                <w:b w:val="0"/>
+                <w:bCs w:val="0"/>
+              </w:rPr>
+              <w:t>abbreviation</w:t>
+            </w:r>
+            <w:proofErr w:type="spellEnd"/>
+          </w:p>
+        </w:tc>
+        <w:tc>
+          <w:tcPr>
+            <w:tcW w:w="1863" w:type="dxa"/>
+          </w:tcPr>
+          <w:p>
+            <w:pPr>
+              <w:cnfStyle w:val="000000000000" w:firstRow="0" w:lastRow="0" w:firstColumn="0" w:lastColumn="0" w:oddVBand="0" w:evenVBand="0" w:oddHBand="0" w:evenHBand="0" w:firstRowFirstColumn="0" w:firstRowLastColumn="0" w:lastRowFirstColumn="0" w:lastRowLastColumn="0"/>
+            </w:pPr>
+          </w:p>
+        </w:tc>
+        <w:tc>
+          <w:tcPr>
+            <w:tcW w:w="1864" w:type="dxa"/>
+          </w:tcPr>
+          <w:p>
+            <w:pPr>
+              <w:cnfStyle w:val="000000000000" w:firstRow="0" w:lastRow="0" w:firstColumn="0" w:lastColumn="0" w:oddVBand="0" w:evenVBand="0" w:oddHBand="0" w:evenHBand="0" w:firstRowFirstColumn="0" w:firstRowLastColumn="0" w:lastRowFirstColumn="0" w:lastRowLastColumn="0"/>
+            </w:pPr>
+            <w:r>
+              <w:t>Ano</w:t>
+            </w:r>
+          </w:p>
+        </w:tc>
+        <w:tc>
+          <w:tcPr>
+            <w:tcW w:w="1864" w:type="dxa"/>
+          </w:tcPr>
+          <w:p>
+            <w:pPr>
+              <w:cnfStyle w:val="000000000000" w:firstRow="0" w:lastRow="0" w:firstColumn="0" w:lastColumn="0" w:oddVBand="0" w:evenVBand="0" w:oddHBand="0" w:evenHBand="0" w:firstRowFirstColumn="0" w:firstRowLastColumn="0" w:lastRowFirstColumn="0" w:lastRowLastColumn="0"/>
+            </w:pPr>
+          </w:p>
+        </w:tc>
+      </w:tr>
+      <w:tr>
+        <w:trPr>
+          <w:trHeight w:val="222"/>
+        </w:trPr>
+        <w:tc>
+          <w:tcPr>
+            <w:cnfStyle w:val="001000000000" w:firstRow="0" w:lastRow="0" w:firstColumn="1" w:lastColumn="0" w:oddVBand="0" w:evenVBand="0" w:oddHBand="0" w:evenHBand="0" w:firstRowFirstColumn="0" w:firstRowLastColumn="0" w:lastRowFirstColumn="0" w:lastRowLastColumn="0"/>
+            <w:tcW w:w="1865" w:type="dxa"/>
+          </w:tcPr>
+          <w:p>
+            <w:pPr>
+              <w:pStyle w:val="Kd"/>
+              <w:rPr>
+                <w:b w:val="0"/>
+                <w:bCs w:val="0"/>
+              </w:rPr>
+            </w:pPr>
+            <w:proofErr w:type="spellStart"/>
+            <w:r>
+              <w:rPr>
+                <w:b w:val="0"/>
+                <w:bCs w:val="0"/>
+              </w:rPr>
+              <w:t>Description</w:t>
+            </w:r>
+            <w:proofErr w:type="spellEnd"/>
+          </w:p>
+        </w:tc>
+        <w:tc>
+          <w:tcPr>
+            <w:tcW w:w="1863" w:type="dxa"/>
+          </w:tcPr>
+          <w:p>
+            <w:pPr>
+              <w:cnfStyle w:val="000000000000" w:firstRow="0" w:lastRow="0" w:firstColumn="0" w:lastColumn="0" w:oddVBand="0" w:evenVBand="0" w:oddHBand="0" w:evenHBand="0" w:firstRowFirstColumn="0" w:firstRowLastColumn="0" w:lastRowFirstColumn="0" w:lastRowLastColumn="0"/>
+            </w:pPr>
+          </w:p>
+        </w:tc>
+        <w:tc>
+          <w:tcPr>
+            <w:tcW w:w="1864" w:type="dxa"/>
+          </w:tcPr>
+          <w:p>
+            <w:pPr>
+              <w:cnfStyle w:val="000000000000" w:firstRow="0" w:lastRow="0" w:firstColumn="0" w:lastColumn="0" w:oddVBand="0" w:evenVBand="0" w:oddHBand="0" w:evenHBand="0" w:firstRowFirstColumn="0" w:firstRowLastColumn="0" w:lastRowFirstColumn="0" w:lastRowLastColumn="0"/>
+            </w:pPr>
+            <w:r>
+              <w:t>Ne</w:t>
+            </w:r>
+          </w:p>
+        </w:tc>
+        <w:tc>
+          <w:tcPr>
+            <w:tcW w:w="1864" w:type="dxa"/>
+          </w:tcPr>
+          <w:p>
+            <w:pPr>
+              <w:cnfStyle w:val="000000000000" w:firstRow="0" w:lastRow="0" w:firstColumn="0" w:lastColumn="0" w:oddVBand="0" w:evenVBand="0" w:oddHBand="0" w:evenHBand="0" w:firstRowFirstColumn="0" w:firstRowLastColumn="0" w:lastRowFirstColumn="0" w:lastRowLastColumn="0"/>
+            </w:pPr>
+          </w:p>
+        </w:tc>
+      </w:tr>
+    </w:tbl>
+    <w:p/>
+    <w:p>
+      <w:pPr>
+        <w:spacing w:before="0" w:after="160" w:line="259" w:lineRule="auto"/>
+      </w:pPr>
+      <w:r>
+        <w:br w:type="page"/>
+      </w:r>
+    </w:p>
+    <w:p>
+      <w:pPr>
+        <w:pStyle w:val="Neslovannadpis"/>
+      </w:pPr>
+      <w:r>
+        <w:lastRenderedPageBreak/>
+        <w:t>Seznam použitých pojmů a zkratek</w:t>
+      </w:r>
+    </w:p>
+    <w:p>
+      <w:pPr>
+        <w:ind w:firstLine="360"/>
+      </w:pPr>
+      <w:r>
+        <w:rPr>
+          <w:b/>
+          <w:bCs/>
+        </w:rPr>
+        <w:t>AI</w:t>
+      </w:r>
+      <w:r>
+        <w:t xml:space="preserve"> (</w:t>
+      </w:r>
+      <w:r>
+        <w:rPr>
+          <w:i/>
+          <w:iCs/>
+        </w:rPr>
+        <w:t>neboli</w:t>
+      </w:r>
+      <w:r>
+        <w:t xml:space="preserve"> </w:t>
+      </w:r>
+      <w:proofErr w:type="spellStart"/>
+      <w:r>
+        <w:rPr>
+          <w:b/>
+          <w:bCs/>
+          <w:i/>
+          <w:iCs/>
+        </w:rPr>
+        <w:t>artificial</w:t>
+      </w:r>
+      <w:proofErr w:type="spellEnd"/>
+      <w:r>
+        <w:rPr>
+          <w:b/>
+          <w:bCs/>
+          <w:i/>
+          <w:iCs/>
+        </w:rPr>
+        <w:t xml:space="preserve"> </w:t>
+      </w:r>
+      <w:proofErr w:type="spellStart"/>
+      <w:r>
+        <w:rPr>
+          <w:b/>
+          <w:bCs/>
+          <w:i/>
+          <w:iCs/>
+        </w:rPr>
+        <w:t>intelligence</w:t>
+      </w:r>
+      <w:proofErr w:type="spellEnd"/>
+      <w:r>
+        <w:t xml:space="preserve"> – česky</w:t>
+      </w:r>
+      <w:r>
+        <w:t xml:space="preserve"> </w:t>
+      </w:r>
+      <w:r>
+        <w:rPr>
+          <w:b/>
+          <w:bCs/>
+          <w:i/>
+          <w:iCs/>
+        </w:rPr>
+        <w:t>umělá</w:t>
+      </w:r>
+      <w:r>
+        <w:rPr>
+          <w:b/>
+          <w:bCs/>
+        </w:rPr>
+        <w:t xml:space="preserve"> </w:t>
+      </w:r>
+      <w:r>
+        <w:rPr>
+          <w:b/>
+          <w:bCs/>
+          <w:i/>
+          <w:iCs/>
+        </w:rPr>
+        <w:t>inteligence</w:t>
+      </w:r>
+      <w:r>
+        <w:t>)</w:t>
+      </w:r>
+      <w:r>
+        <w:t xml:space="preserve"> je obor informatiky, který se zabývá tvorbou systémů schopných vykazovat rysy lidské inteligence – například učení, rozhodování a řešení problémů – prostřednictvím algoritmů a strojového učení.</w:t>
+      </w:r>
+    </w:p>
+    <w:p>
+      <w:pPr>
+        <w:ind w:firstLine="360"/>
+      </w:pPr>
+      <w:r>
+        <w:rPr>
+          <w:b/>
+          <w:bCs/>
+        </w:rPr>
+        <w:t>AI halucinace</w:t>
+      </w:r>
+      <w:r>
+        <w:t xml:space="preserve"> označuje fenomén, kdy umělá inteligence generuje nesprávné, smyšlené nebo nesouvisející informace bez opory v ověřitelných datech, což může vést k nepřesným či zavádějícím výsledkům.</w:t>
+      </w:r>
+    </w:p>
+    <w:p>
+      <w:pPr>
+        <w:ind w:firstLine="360"/>
+      </w:pPr>
+      <w:r>
+        <w:rPr>
+          <w:b/>
+          <w:bCs/>
+        </w:rPr>
+        <w:t>Prompt</w:t>
+      </w:r>
+      <w:r>
+        <w:t xml:space="preserve"> je vstupní dotaz nebo instrukce, kterou uživatel poskytuje systému umělé inteligence, aby vyvolal konkrétní odpověď či akci. </w:t>
+      </w:r>
+    </w:p>
+    <w:p>
+      <w:pPr>
+        <w:ind w:firstLine="360"/>
+      </w:pPr>
+      <w:proofErr w:type="spellStart"/>
+      <w:r>
+        <w:rPr>
+          <w:b/>
+          <w:bCs/>
+        </w:rPr>
+        <w:t>Promptování</w:t>
+      </w:r>
+      <w:proofErr w:type="spellEnd"/>
+      <w:r>
+        <w:t xml:space="preserve"> je proces formulování</w:t>
+      </w:r>
+      <w:r>
+        <w:t xml:space="preserve"> a</w:t>
+      </w:r>
+      <w:r>
+        <w:t xml:space="preserve"> zadávání promptů.</w:t>
+      </w:r>
+    </w:p>
+    <w:p>
+      <w:pPr>
+        <w:ind w:firstLine="360"/>
+        <w:rPr>
+          <w:rFonts w:eastAsiaTheme="majorEastAsia"/>
+        </w:rPr>
+      </w:pPr>
+      <w:r>
+        <w:rPr>
+          <w:rFonts w:eastAsiaTheme="majorEastAsia"/>
+          <w:b/>
+          <w:bCs/>
+        </w:rPr>
+        <w:t>XML</w:t>
+      </w:r>
+      <w:r>
+        <w:rPr>
+          <w:rFonts w:eastAsiaTheme="majorEastAsia"/>
+        </w:rPr>
+        <w:t xml:space="preserve"> (</w:t>
+      </w:r>
+      <w:proofErr w:type="spellStart"/>
+      <w:r>
+        <w:rPr>
+          <w:rFonts w:eastAsiaTheme="majorEastAsia"/>
+        </w:rPr>
+        <w:t>eXtensible</w:t>
+      </w:r>
+      <w:proofErr w:type="spellEnd"/>
+      <w:r>
+        <w:rPr>
+          <w:rFonts w:eastAsiaTheme="majorEastAsia"/>
+        </w:rPr>
+        <w:t xml:space="preserve"> </w:t>
+      </w:r>
+      <w:proofErr w:type="spellStart"/>
+      <w:r>
+        <w:rPr>
+          <w:rFonts w:eastAsiaTheme="majorEastAsia"/>
+        </w:rPr>
+        <w:t>Markup</w:t>
+      </w:r>
+      <w:proofErr w:type="spellEnd"/>
+      <w:r>
+        <w:rPr>
+          <w:rFonts w:eastAsiaTheme="majorEastAsia"/>
+        </w:rPr>
+        <w:t xml:space="preserve"> </w:t>
+      </w:r>
+      <w:proofErr w:type="spellStart"/>
+      <w:r>
+        <w:rPr>
+          <w:rFonts w:eastAsiaTheme="majorEastAsia"/>
+        </w:rPr>
+        <w:t>Language</w:t>
+      </w:r>
+      <w:proofErr w:type="spellEnd"/>
+      <w:r>
+        <w:rPr>
+          <w:rFonts w:eastAsiaTheme="majorEastAsia"/>
+        </w:rPr>
+        <w:t>) je značkovací jazyk určený pro strukturované ukládání a přenos dat. Umožňuje definovat vlastní tagy a hierarchickou strukturu, což usnadňuje formátování, sdílení a interpretaci dat mezi různými systémy.</w:t>
+      </w:r>
+    </w:p>
+    <w:p>
+      <w:pPr>
         <w:spacing w:before="0" w:after="160" w:line="259" w:lineRule="auto"/>
         <w:ind w:firstLine="360"/>
       </w:pPr>
@@ -5325,6 +6377,40 @@
       </w:r>
       <w:r>
         <w:t xml:space="preserve"> souboru) za účelem jejich rozdělení a převedení do strukturované formy, kterou může program snadno zpracovat. Tento proces umožňuje extrakci a organizaci informací z textového nebo jiného formátu.</w:t>
+      </w:r>
+    </w:p>
+    <w:p>
+      <w:pPr>
+        <w:spacing w:before="0" w:after="160" w:line="259" w:lineRule="auto"/>
+        <w:ind w:firstLine="360"/>
+        <w:rPr>
+          <w:b/>
+          <w:bCs/>
+        </w:rPr>
+      </w:pPr>
+      <w:r>
+        <w:rPr>
+          <w:b/>
+          <w:bCs/>
+        </w:rPr>
+        <w:t>E-R model</w:t>
+      </w:r>
+    </w:p>
+    <w:p>
+      <w:pPr>
+        <w:spacing w:before="0" w:after="160" w:line="259" w:lineRule="auto"/>
+        <w:ind w:firstLine="360"/>
+        <w:rPr>
+          <w:b/>
+          <w:bCs/>
+        </w:rPr>
+      </w:pPr>
+      <w:r>
+        <w:rPr>
+          <w:b/>
+          <w:bCs/>
+        </w:rPr>
+        <w:t>UI</w:t>
       </w:r>
     </w:p>
     <w:p>
@@ -5367,7 +6453,7 @@
       <w:r>
         <w:t>. Online. Wikipedie. 2025. Dostupné z: </w:t>
       </w:r>
-      <w:hyperlink r:id="rId11" w:history="1">
+      <w:hyperlink r:id="rId12" w:history="1">
         <w:r>
           <w:rPr>
             <w:rStyle w:val="Hypertextovodkaz"/>
@@ -5427,7 +6513,7 @@
       <w:r>
         <w:t>. 2024. Dostupné z: </w:t>
       </w:r>
-      <w:hyperlink r:id="rId12" w:history="1">
+      <w:hyperlink r:id="rId13" w:history="1">
         <w:r>
           <w:rPr>
             <w:rStyle w:val="Hypertextovodkaz"/>
@@ -5481,7 +6567,7 @@
       <w:r>
         <w:t xml:space="preserve"> Data Science. 2024. Dostupné z: </w:t>
       </w:r>
-      <w:hyperlink r:id="rId13" w:history="1">
+      <w:hyperlink r:id="rId14" w:history="1">
         <w:r>
           <w:rPr>
             <w:rStyle w:val="Hypertextovodkaz"/>
@@ -5540,7 +6626,7 @@
       <w:r>
         <w:t>. 2024. Dostupné z: </w:t>
       </w:r>
-      <w:hyperlink r:id="rId14" w:history="1">
+      <w:hyperlink r:id="rId15" w:history="1">
         <w:r>
           <w:rPr>
             <w:rStyle w:val="Hypertextovodkaz"/>
@@ -5574,7 +6660,7 @@
       <w:r>
         <w:t>. Online. Oracle. 2025. Dostupné z: </w:t>
       </w:r>
-      <w:hyperlink r:id="rId15" w:history="1">
+      <w:hyperlink r:id="rId16" w:history="1">
         <w:r>
           <w:rPr>
             <w:rStyle w:val="Hypertextovodkaz"/>
@@ -5623,7 +6709,7 @@
       <w:r>
         <w:t>z: </w:t>
       </w:r>
-      <w:hyperlink r:id="rId16" w:history="1">
+      <w:hyperlink r:id="rId17" w:history="1">
         <w:r>
           <w:rPr>
             <w:rStyle w:val="Hypertextovodkaz"/>
@@ -5674,7 +6760,7 @@
       <w:r>
         <w:t>. 2025. Dostupné z: </w:t>
       </w:r>
-      <w:hyperlink r:id="rId17" w:history="1">
+      <w:hyperlink r:id="rId18" w:history="1">
         <w:r>
           <w:rPr>
             <w:rStyle w:val="Hypertextovodkaz"/>
@@ -5742,7 +6828,7 @@
       <w:r>
         <w:t>. 2025. Dostupné z: </w:t>
       </w:r>
-      <w:hyperlink r:id="rId18" w:history="1">
+      <w:hyperlink r:id="rId19" w:history="1">
         <w:r>
           <w:rPr>
             <w:rStyle w:val="Hypertextovodkaz"/>
@@ -5838,7 +6924,7 @@
       <w:r>
         <w:t xml:space="preserve"> Project. 2025. Dostupné z: </w:t>
       </w:r>
-      <w:hyperlink r:id="rId19" w:history="1">
+      <w:hyperlink r:id="rId20" w:history="1">
         <w:r>
           <w:rPr>
             <w:rStyle w:val="Hypertextovodkaz"/>
@@ -5872,7 +6958,7 @@
       <w:r>
         <w:t>. Online. Git. 2025. Dostupné z: </w:t>
       </w:r>
-      <w:hyperlink r:id="rId20" w:history="1">
+      <w:hyperlink r:id="rId21" w:history="1">
         <w:r>
           <w:rPr>
             <w:rStyle w:val="Hypertextovodkaz"/>
@@ -5916,7 +7002,7 @@
       <w:r>
         <w:t>. 2025. Dostupné z: </w:t>
       </w:r>
-      <w:hyperlink r:id="rId21" w:history="1">
+      <w:hyperlink r:id="rId22" w:history="1">
         <w:r>
           <w:rPr>
             <w:rStyle w:val="Hypertextovodkaz"/>
@@ -5966,7 +7052,7 @@
       <w:r>
         <w:t>. 2025. Dostupné z: </w:t>
       </w:r>
-      <w:hyperlink r:id="rId22" w:history="1">
+      <w:hyperlink r:id="rId23" w:history="1">
         <w:r>
           <w:rPr>
             <w:rStyle w:val="Hypertextovodkaz"/>
@@ -6010,7 +7096,7 @@
       <w:r>
         <w:t>. 2025. Dostupné z: </w:t>
       </w:r>
-      <w:hyperlink r:id="rId23" w:history="1">
+      <w:hyperlink r:id="rId24" w:history="1">
         <w:r>
           <w:rPr>
             <w:rStyle w:val="Hypertextovodkaz"/>
@@ -6060,7 +7146,7 @@
       <w:r>
         <w:t>. 2025. Dostupné z: </w:t>
       </w:r>
-      <w:hyperlink r:id="rId24" w:history="1">
+      <w:hyperlink r:id="rId25" w:history="1">
         <w:r>
           <w:rPr>
             <w:rStyle w:val="Hypertextovodkaz"/>
@@ -6133,7 +7219,7 @@
       <w:r>
         <w:t xml:space="preserve"> POI. 2025. Dostupné z: </w:t>
       </w:r>
-      <w:hyperlink r:id="rId25" w:history="1">
+      <w:hyperlink r:id="rId26" w:history="1">
         <w:r>
           <w:rPr>
             <w:rStyle w:val="Hypertextovodkaz"/>
@@ -6167,7 +7253,7 @@
       <w:r>
         <w:t>. Online. XML. 2025. Dostupné z: </w:t>
       </w:r>
-      <w:hyperlink r:id="rId26" w:history="1">
+      <w:hyperlink r:id="rId27" w:history="1">
         <w:r>
           <w:rPr>
             <w:rStyle w:val="Hypertextovodkaz"/>
@@ -6217,7 +7303,7 @@
       <w:r>
         <w:t>. 2025. Dostupné z: </w:t>
       </w:r>
-      <w:hyperlink r:id="rId27" w:history="1">
+      <w:hyperlink r:id="rId28" w:history="1">
         <w:r>
           <w:rPr>
             <w:rStyle w:val="Hypertextovodkaz"/>
@@ -6259,7 +7345,7 @@
       <w:r>
         <w:t>. Online. JSON. 2025. Dostupné z: </w:t>
       </w:r>
-      <w:hyperlink r:id="rId28" w:history="1">
+      <w:hyperlink r:id="rId29" w:history="1">
         <w:r>
           <w:rPr>
             <w:rStyle w:val="Hypertextovodkaz"/>
@@ -6333,7 +7419,7 @@
       <w:r>
         <w:t>. 2025. Dostupné z: </w:t>
       </w:r>
-      <w:hyperlink r:id="rId29" w:history="1">
+      <w:hyperlink r:id="rId30" w:history="1">
         <w:r>
           <w:rPr>
             <w:rStyle w:val="Hypertextovodkaz"/>
@@ -6395,7 +7481,7 @@
       <w:r>
         <w:t>. Online. XAMPP. 2025. Dostupné z: </w:t>
       </w:r>
-      <w:hyperlink r:id="rId30" w:history="1">
+      <w:hyperlink r:id="rId31" w:history="1">
         <w:r>
           <w:rPr>
             <w:rStyle w:val="Hypertextovodkaz"/>
@@ -6516,7 +7602,18 @@
       <w:pPr>
         <w:pStyle w:val="Neslovannadpis"/>
       </w:pPr>
-      <w:fldSimple w:instr=" TOC \h \z \a &quot;Obrázek&quot; "/>
+      <w:r>
+        <w:fldChar w:fldCharType="begin"/>
+      </w:r>
+      <w:r>
+        <w:instrText xml:space="preserve"> TOC \h \z \a "Obrázek" </w:instrText>
+      </w:r>
+      <w:r>
+        <w:fldChar w:fldCharType="separate"/>
+      </w:r>
+      <w:r>
+        <w:fldChar w:fldCharType="end"/>
+      </w:r>
       <w:r>
         <w:t>Seznam kódů</w:t>
       </w:r>
@@ -6528,11 +7625,22 @@
           <w:tab w:val="right" w:leader="dot" w:pos="9062"/>
         </w:tabs>
       </w:pPr>
-      <w:fldSimple w:instr=" TOC \h \z \a &quot;Kód&quot; "/>
+      <w:r>
+        <w:fldChar w:fldCharType="begin"/>
+      </w:r>
+      <w:r>
+        <w:instrText xml:space="preserve"> TOC \h \z \a "Kód" </w:instrText>
+      </w:r>
+      <w:r>
+        <w:fldChar w:fldCharType="separate"/>
+      </w:r>
+      <w:r>
+        <w:fldChar w:fldCharType="end"/>
+      </w:r>
     </w:p>
     <w:sectPr>
-      <w:headerReference w:type="default" r:id="rId31"/>
-      <w:headerReference w:type="first" r:id="rId32"/>
+      <w:headerReference w:type="default" r:id="rId32"/>
+      <w:headerReference w:type="first" r:id="rId33"/>
       <w:pgSz w:w="11906" w:h="16838"/>
       <w:pgMar w:top="1417" w:right="1417" w:bottom="1417" w:left="1417" w:header="708" w:footer="708" w:gutter="0"/>
       <w:pgNumType w:start="0"/>
@@ -8245,7 +9353,7 @@
   <w:abstractNum w:abstractNumId="12" w15:restartNumberingAfterBreak="0">
     <w:nsid w:val="10FC5665"/>
     <w:multiLevelType w:val="multilevel"/>
-    <w:tmpl w:val="73E0B444"/>
+    <w:tmpl w:val="C3CE4D00"/>
     <w:lvl w:ilvl="0">
       <w:start w:val="1"/>
       <w:numFmt w:val="decimal"/>
@@ -18999,7 +20107,7 @@
     <w:uiPriority w:val="9"/>
     <w:unhideWhenUsed/>
     <w:qFormat/>
-    <w:rsid w:val="00CA7A35"/>
+    <w:rsid w:val="00DF38A6"/>
     <w:pPr>
       <w:keepNext/>
       <w:keepLines/>
@@ -19014,7 +20122,7 @@
     <w:rPr>
       <w:rFonts w:eastAsiaTheme="majorEastAsia" w:cstheme="majorBidi"/>
       <w:color w:val="000000" w:themeColor="text1"/>
-      <w:sz w:val="28"/>
+      <w:sz w:val="32"/>
       <w:szCs w:val="32"/>
     </w:rPr>
   </w:style>
@@ -19027,7 +20135,7 @@
     <w:uiPriority w:val="9"/>
     <w:unhideWhenUsed/>
     <w:qFormat/>
-    <w:rsid w:val="00716B72"/>
+    <w:rsid w:val="00E03FE1"/>
     <w:pPr>
       <w:keepNext/>
       <w:keepLines/>
@@ -19035,7 +20143,7 @@
         <w:ilvl w:val="2"/>
         <w:numId w:val="8"/>
       </w:numPr>
-      <w:spacing w:before="160" w:after="80"/>
+      <w:spacing w:before="160" w:after="240"/>
       <w:outlineLvl w:val="2"/>
     </w:pPr>
     <w:rPr>
@@ -19246,12 +20354,12 @@
     <w:basedOn w:val="Standardnpsmoodstavce"/>
     <w:link w:val="Nadpis2"/>
     <w:uiPriority w:val="9"/>
-    <w:rsid w:val="00CA7A35"/>
+    <w:rsid w:val="00DF38A6"/>
     <w:rPr>
       <w:rFonts w:ascii="Cambria" w:eastAsiaTheme="majorEastAsia" w:hAnsi="Cambria" w:cstheme="majorBidi"/>
       <w:color w:val="000000" w:themeColor="text1"/>
       <w:kern w:val="0"/>
-      <w:sz w:val="28"/>
+      <w:sz w:val="32"/>
       <w:szCs w:val="32"/>
       <w:lang w:eastAsia="cs-CZ"/>
       <w14:ligatures w14:val="none"/>
@@ -19262,7 +20370,7 @@
     <w:basedOn w:val="Standardnpsmoodstavce"/>
     <w:link w:val="Nadpis3"/>
     <w:uiPriority w:val="9"/>
-    <w:rsid w:val="00716B72"/>
+    <w:rsid w:val="00E03FE1"/>
     <w:rPr>
       <w:rFonts w:ascii="Cambria" w:eastAsiaTheme="majorEastAsia" w:hAnsi="Cambria" w:cstheme="majorBidi"/>
       <w:color w:val="000000" w:themeColor="text1"/>
@@ -19962,6 +21070,404 @@
       <w14:ligatures w14:val="none"/>
     </w:rPr>
   </w:style>
+  <w:style w:type="paragraph" w:customStyle="1" w:styleId="Kdvnadpisu">
+    <w:name w:val="Kód v nadpisu"/>
+    <w:basedOn w:val="Kd"/>
+    <w:next w:val="Normln"/>
+    <w:link w:val="KdvnadpisuChar"/>
+    <w:qFormat/>
+    <w:rsid w:val="00E03FE1"/>
+    <w:pPr>
+      <w:numPr>
+        <w:ilvl w:val="2"/>
+        <w:numId w:val="8"/>
+      </w:numPr>
+      <w:spacing w:after="240"/>
+    </w:pPr>
+    <w:rPr>
+      <w:sz w:val="23"/>
+    </w:rPr>
+  </w:style>
+  <w:style w:type="character" w:customStyle="1" w:styleId="KdvnadpisuChar">
+    <w:name w:val="Kód v nadpisu Char"/>
+    <w:basedOn w:val="KdChar"/>
+    <w:link w:val="Kdvnadpisu"/>
+    <w:rsid w:val="00E03FE1"/>
+    <w:rPr>
+      <w:rFonts w:ascii="Consolas" w:eastAsia="Times New Roman" w:hAnsi="Consolas" w:cs="Times New Roman"/>
+      <w:kern w:val="0"/>
+      <w:sz w:val="23"/>
+      <w:szCs w:val="20"/>
+      <w:lang w:eastAsia="cs-CZ"/>
+      <w14:ligatures w14:val="none"/>
+    </w:rPr>
+  </w:style>
+  <w:style w:type="table" w:styleId="Mkatabulky">
+    <w:name w:val="Table Grid"/>
+    <w:basedOn w:val="Normlntabulka"/>
+    <w:uiPriority w:val="39"/>
+    <w:rsid w:val="004E69A9"/>
+    <w:pPr>
+      <w:spacing w:after="0" w:line="240" w:lineRule="auto"/>
+    </w:pPr>
+    <w:tblPr>
+      <w:tblBorders>
+        <w:top w:val="single" w:sz="4" w:space="0" w:color="auto"/>
+        <w:left w:val="single" w:sz="4" w:space="0" w:color="auto"/>
+        <w:bottom w:val="single" w:sz="4" w:space="0" w:color="auto"/>
+        <w:right w:val="single" w:sz="4" w:space="0" w:color="auto"/>
+        <w:insideH w:val="single" w:sz="4" w:space="0" w:color="auto"/>
+        <w:insideV w:val="single" w:sz="4" w:space="0" w:color="auto"/>
+      </w:tblBorders>
+    </w:tblPr>
+  </w:style>
+  <w:style w:type="table" w:styleId="Tabulkasmkou4">
+    <w:name w:val="Grid Table 4"/>
+    <w:basedOn w:val="Normlntabulka"/>
+    <w:uiPriority w:val="49"/>
+    <w:rsid w:val="004E69A9"/>
+    <w:pPr>
+      <w:spacing w:after="0" w:line="240" w:lineRule="auto"/>
+    </w:pPr>
+    <w:tblPr>
+      <w:tblStyleRowBandSize w:val="1"/>
+      <w:tblStyleColBandSize w:val="1"/>
+      <w:tblBorders>
+        <w:top w:val="single" w:sz="4" w:space="0" w:color="666666" w:themeColor="text1" w:themeTint="99"/>
+        <w:left w:val="single" w:sz="4" w:space="0" w:color="666666" w:themeColor="text1" w:themeTint="99"/>
+        <w:bottom w:val="single" w:sz="4" w:space="0" w:color="666666" w:themeColor="text1" w:themeTint="99"/>
+        <w:right w:val="single" w:sz="4" w:space="0" w:color="666666" w:themeColor="text1" w:themeTint="99"/>
+        <w:insideH w:val="single" w:sz="4" w:space="0" w:color="666666" w:themeColor="text1" w:themeTint="99"/>
+        <w:insideV w:val="single" w:sz="4" w:space="0" w:color="666666" w:themeColor="text1" w:themeTint="99"/>
+      </w:tblBorders>
+    </w:tblPr>
+    <w:tblStylePr w:type="firstRow">
+      <w:rPr>
+        <w:b/>
+        <w:bCs/>
+        <w:color w:val="FFFFFF" w:themeColor="background1"/>
+      </w:rPr>
+      <w:tblPr/>
+      <w:tcPr>
+        <w:tcBorders>
+          <w:top w:val="single" w:sz="4" w:space="0" w:color="000000" w:themeColor="text1"/>
+          <w:left w:val="single" w:sz="4" w:space="0" w:color="000000" w:themeColor="text1"/>
+          <w:bottom w:val="single" w:sz="4" w:space="0" w:color="000000" w:themeColor="text1"/>
+          <w:right w:val="single" w:sz="4" w:space="0" w:color="000000" w:themeColor="text1"/>
+          <w:insideH w:val="nil"/>
+          <w:insideV w:val="nil"/>
+        </w:tcBorders>
+        <w:shd w:val="clear" w:color="auto" w:fill="000000" w:themeFill="text1"/>
+      </w:tcPr>
+    </w:tblStylePr>
+    <w:tblStylePr w:type="lastRow">
+      <w:rPr>
+        <w:b/>
+        <w:bCs/>
+      </w:rPr>
+      <w:tblPr/>
+      <w:tcPr>
+        <w:tcBorders>
+          <w:top w:val="double" w:sz="4" w:space="0" w:color="000000" w:themeColor="text1"/>
+        </w:tcBorders>
+      </w:tcPr>
+    </w:tblStylePr>
+    <w:tblStylePr w:type="firstCol">
+      <w:rPr>
+        <w:b/>
+        <w:bCs/>
+      </w:rPr>
+    </w:tblStylePr>
+    <w:tblStylePr w:type="lastCol">
+      <w:rPr>
+        <w:b/>
+        <w:bCs/>
+      </w:rPr>
+    </w:tblStylePr>
+    <w:tblStylePr w:type="band1Vert">
+      <w:tblPr/>
+      <w:tcPr>
+        <w:shd w:val="clear" w:color="auto" w:fill="CCCCCC" w:themeFill="text1" w:themeFillTint="33"/>
+      </w:tcPr>
+    </w:tblStylePr>
+    <w:tblStylePr w:type="band1Horz">
+      <w:tblPr/>
+      <w:tcPr>
+        <w:shd w:val="clear" w:color="auto" w:fill="CCCCCC" w:themeFill="text1" w:themeFillTint="33"/>
+      </w:tcPr>
+    </w:tblStylePr>
+  </w:style>
+  <w:style w:type="table" w:styleId="Svtlmkatabulky">
+    <w:name w:val="Grid Table Light"/>
+    <w:basedOn w:val="Normlntabulka"/>
+    <w:uiPriority w:val="40"/>
+    <w:rsid w:val="004E69A9"/>
+    <w:pPr>
+      <w:spacing w:after="0" w:line="240" w:lineRule="auto"/>
+    </w:pPr>
+    <w:tblPr>
+      <w:tblBorders>
+        <w:top w:val="single" w:sz="4" w:space="0" w:color="BFBFBF" w:themeColor="background1" w:themeShade="BF"/>
+        <w:left w:val="single" w:sz="4" w:space="0" w:color="BFBFBF" w:themeColor="background1" w:themeShade="BF"/>
+        <w:bottom w:val="single" w:sz="4" w:space="0" w:color="BFBFBF" w:themeColor="background1" w:themeShade="BF"/>
+        <w:right w:val="single" w:sz="4" w:space="0" w:color="BFBFBF" w:themeColor="background1" w:themeShade="BF"/>
+        <w:insideH w:val="single" w:sz="4" w:space="0" w:color="BFBFBF" w:themeColor="background1" w:themeShade="BF"/>
+        <w:insideV w:val="single" w:sz="4" w:space="0" w:color="BFBFBF" w:themeColor="background1" w:themeShade="BF"/>
+      </w:tblBorders>
+    </w:tblPr>
+  </w:style>
+  <w:style w:type="table" w:styleId="Prosttabulka1">
+    <w:name w:val="Plain Table 1"/>
+    <w:basedOn w:val="Normlntabulka"/>
+    <w:uiPriority w:val="41"/>
+    <w:rsid w:val="004E69A9"/>
+    <w:pPr>
+      <w:spacing w:after="0" w:line="240" w:lineRule="auto"/>
+    </w:pPr>
+    <w:tblPr>
+      <w:tblStyleRowBandSize w:val="1"/>
+      <w:tblStyleColBandSize w:val="1"/>
+      <w:tblBorders>
+        <w:top w:val="single" w:sz="4" w:space="0" w:color="BFBFBF" w:themeColor="background1" w:themeShade="BF"/>
+        <w:left w:val="single" w:sz="4" w:space="0" w:color="BFBFBF" w:themeColor="background1" w:themeShade="BF"/>
+        <w:bottom w:val="single" w:sz="4" w:space="0" w:color="BFBFBF" w:themeColor="background1" w:themeShade="BF"/>
+        <w:right w:val="single" w:sz="4" w:space="0" w:color="BFBFBF" w:themeColor="background1" w:themeShade="BF"/>
+        <w:insideH w:val="single" w:sz="4" w:space="0" w:color="BFBFBF" w:themeColor="background1" w:themeShade="BF"/>
+        <w:insideV w:val="single" w:sz="4" w:space="0" w:color="BFBFBF" w:themeColor="background1" w:themeShade="BF"/>
+      </w:tblBorders>
+    </w:tblPr>
+    <w:tblStylePr w:type="firstRow">
+      <w:rPr>
+        <w:b/>
+        <w:bCs/>
+      </w:rPr>
+    </w:tblStylePr>
+    <w:tblStylePr w:type="lastRow">
+      <w:rPr>
+        <w:b/>
+        <w:bCs/>
+      </w:rPr>
+      <w:tblPr/>
+      <w:tcPr>
+        <w:tcBorders>
+          <w:top w:val="double" w:sz="4" w:space="0" w:color="BFBFBF" w:themeColor="background1" w:themeShade="BF"/>
+        </w:tcBorders>
+      </w:tcPr>
+    </w:tblStylePr>
+    <w:tblStylePr w:type="firstCol">
+      <w:rPr>
+        <w:b/>
+        <w:bCs/>
+      </w:rPr>
+    </w:tblStylePr>
+    <w:tblStylePr w:type="lastCol">
+      <w:rPr>
+        <w:b/>
+        <w:bCs/>
+      </w:rPr>
+    </w:tblStylePr>
+    <w:tblStylePr w:type="band1Vert">
+      <w:tblPr/>
+      <w:tcPr>
+        <w:shd w:val="clear" w:color="auto" w:fill="F2F2F2" w:themeFill="background1" w:themeFillShade="F2"/>
+      </w:tcPr>
+    </w:tblStylePr>
+    <w:tblStylePr w:type="band1Horz">
+      <w:tblPr/>
+      <w:tcPr>
+        <w:shd w:val="clear" w:color="auto" w:fill="F2F2F2" w:themeFill="background1" w:themeFillShade="F2"/>
+      </w:tcPr>
+    </w:tblStylePr>
+  </w:style>
+  <w:style w:type="table" w:styleId="Svtltabulkasmkou1">
+    <w:name w:val="Grid Table 1 Light"/>
+    <w:basedOn w:val="Normlntabulka"/>
+    <w:uiPriority w:val="46"/>
+    <w:rsid w:val="00E03FE1"/>
+    <w:pPr>
+      <w:spacing w:after="0" w:line="240" w:lineRule="auto"/>
+      <w:jc w:val="center"/>
+    </w:pPr>
+    <w:tblPr>
+      <w:tblStyleRowBandSize w:val="1"/>
+      <w:tblStyleColBandSize w:val="1"/>
+      <w:jc w:val="center"/>
+      <w:tblBorders>
+        <w:top w:val="single" w:sz="4" w:space="0" w:color="auto"/>
+        <w:left w:val="single" w:sz="4" w:space="0" w:color="auto"/>
+        <w:bottom w:val="single" w:sz="4" w:space="0" w:color="auto"/>
+        <w:right w:val="single" w:sz="4" w:space="0" w:color="auto"/>
+        <w:insideH w:val="single" w:sz="4" w:space="0" w:color="auto"/>
+        <w:insideV w:val="single" w:sz="4" w:space="0" w:color="auto"/>
+      </w:tblBorders>
+    </w:tblPr>
+    <w:trPr>
+      <w:jc w:val="center"/>
+    </w:trPr>
+    <w:tblStylePr w:type="firstRow">
+      <w:rPr>
+        <w:b/>
+        <w:bCs/>
+      </w:rPr>
+      <w:tblPr/>
+      <w:tcPr>
+        <w:tcBorders>
+          <w:top w:val="single" w:sz="12" w:space="0" w:color="auto"/>
+          <w:left w:val="single" w:sz="12" w:space="0" w:color="auto"/>
+          <w:bottom w:val="single" w:sz="12" w:space="0" w:color="auto"/>
+          <w:right w:val="single" w:sz="12" w:space="0" w:color="auto"/>
+        </w:tcBorders>
+      </w:tcPr>
+    </w:tblStylePr>
+    <w:tblStylePr w:type="lastRow">
+      <w:rPr>
+        <w:b/>
+        <w:bCs/>
+      </w:rPr>
+      <w:tblPr/>
+      <w:tcPr>
+        <w:tcBorders>
+          <w:top w:val="double" w:sz="2" w:space="0" w:color="666666" w:themeColor="text1" w:themeTint="99"/>
+        </w:tcBorders>
+      </w:tcPr>
+    </w:tblStylePr>
+    <w:tblStylePr w:type="firstCol">
+      <w:rPr>
+        <w:b/>
+        <w:bCs/>
+      </w:rPr>
+    </w:tblStylePr>
+    <w:tblStylePr w:type="lastCol">
+      <w:rPr>
+        <w:b/>
+        <w:bCs/>
+      </w:rPr>
+    </w:tblStylePr>
+  </w:style>
+  <w:style w:type="table" w:styleId="Tabulkaseznamu3">
+    <w:name w:val="List Table 3"/>
+    <w:basedOn w:val="Normlntabulka"/>
+    <w:uiPriority w:val="48"/>
+    <w:rsid w:val="004E69A9"/>
+    <w:pPr>
+      <w:spacing w:after="0" w:line="240" w:lineRule="auto"/>
+    </w:pPr>
+    <w:tblPr>
+      <w:tblStyleRowBandSize w:val="1"/>
+      <w:tblStyleColBandSize w:val="1"/>
+      <w:tblBorders>
+        <w:top w:val="single" w:sz="4" w:space="0" w:color="000000" w:themeColor="text1"/>
+        <w:left w:val="single" w:sz="4" w:space="0" w:color="000000" w:themeColor="text1"/>
+        <w:bottom w:val="single" w:sz="4" w:space="0" w:color="000000" w:themeColor="text1"/>
+        <w:right w:val="single" w:sz="4" w:space="0" w:color="000000" w:themeColor="text1"/>
+      </w:tblBorders>
+    </w:tblPr>
+    <w:tblStylePr w:type="firstRow">
+      <w:rPr>
+        <w:b/>
+        <w:bCs/>
+        <w:color w:val="FFFFFF" w:themeColor="background1"/>
+      </w:rPr>
+      <w:tblPr/>
+      <w:tcPr>
+        <w:shd w:val="clear" w:color="auto" w:fill="000000" w:themeFill="text1"/>
+      </w:tcPr>
+    </w:tblStylePr>
+    <w:tblStylePr w:type="lastRow">
+      <w:rPr>
+        <w:b/>
+        <w:bCs/>
+      </w:rPr>
+      <w:tblPr/>
+      <w:tcPr>
+        <w:tcBorders>
+          <w:top w:val="double" w:sz="4" w:space="0" w:color="000000" w:themeColor="text1"/>
+        </w:tcBorders>
+        <w:shd w:val="clear" w:color="auto" w:fill="FFFFFF" w:themeFill="background1"/>
+      </w:tcPr>
+    </w:tblStylePr>
+    <w:tblStylePr w:type="firstCol">
+      <w:rPr>
+        <w:b/>
+        <w:bCs/>
+      </w:rPr>
+      <w:tblPr/>
+      <w:tcPr>
+        <w:tcBorders>
+          <w:right w:val="nil"/>
+        </w:tcBorders>
+        <w:shd w:val="clear" w:color="auto" w:fill="FFFFFF" w:themeFill="background1"/>
+      </w:tcPr>
+    </w:tblStylePr>
+    <w:tblStylePr w:type="lastCol">
+      <w:rPr>
+        <w:b/>
+        <w:bCs/>
+      </w:rPr>
+      <w:tblPr/>
+      <w:tcPr>
+        <w:tcBorders>
+          <w:left w:val="nil"/>
+        </w:tcBorders>
+        <w:shd w:val="clear" w:color="auto" w:fill="FFFFFF" w:themeFill="background1"/>
+      </w:tcPr>
+    </w:tblStylePr>
+    <w:tblStylePr w:type="band1Vert">
+      <w:tblPr/>
+      <w:tcPr>
+        <w:tcBorders>
+          <w:left w:val="single" w:sz="4" w:space="0" w:color="000000" w:themeColor="text1"/>
+          <w:right w:val="single" w:sz="4" w:space="0" w:color="000000" w:themeColor="text1"/>
+        </w:tcBorders>
+      </w:tcPr>
+    </w:tblStylePr>
+    <w:tblStylePr w:type="band1Horz">
+      <w:tblPr/>
+      <w:tcPr>
+        <w:tcBorders>
+          <w:top w:val="single" w:sz="4" w:space="0" w:color="000000" w:themeColor="text1"/>
+          <w:bottom w:val="single" w:sz="4" w:space="0" w:color="000000" w:themeColor="text1"/>
+          <w:insideH w:val="nil"/>
+        </w:tcBorders>
+      </w:tcPr>
+    </w:tblStylePr>
+    <w:tblStylePr w:type="neCell">
+      <w:tblPr/>
+      <w:tcPr>
+        <w:tcBorders>
+          <w:left w:val="nil"/>
+          <w:bottom w:val="nil"/>
+        </w:tcBorders>
+      </w:tcPr>
+    </w:tblStylePr>
+    <w:tblStylePr w:type="nwCell">
+      <w:tblPr/>
+      <w:tcPr>
+        <w:tcBorders>
+          <w:bottom w:val="nil"/>
+          <w:right w:val="nil"/>
+        </w:tcBorders>
+      </w:tcPr>
+    </w:tblStylePr>
+    <w:tblStylePr w:type="seCell">
+      <w:tblPr/>
+      <w:tcPr>
+        <w:tcBorders>
+          <w:top w:val="double" w:sz="4" w:space="0" w:color="000000" w:themeColor="text1"/>
+          <w:left w:val="nil"/>
+        </w:tcBorders>
+      </w:tcPr>
+    </w:tblStylePr>
+    <w:tblStylePr w:type="swCell">
+      <w:tblPr/>
+      <w:tcPr>
+        <w:tcBorders>
+          <w:top w:val="double" w:sz="4" w:space="0" w:color="000000" w:themeColor="text1"/>
+          <w:right w:val="nil"/>
+        </w:tcBorders>
+      </w:tcPr>
+    </w:tblStylePr>
+  </w:style>
 </w:styles>
 </file>
 
@@ -20172,11 +21678,13 @@
     <w:rsid w:val="00011030"/>
     <w:rsid w:val="002621AF"/>
     <w:rsid w:val="002A7898"/>
+    <w:rsid w:val="003C3B1E"/>
     <w:rsid w:val="00560BE4"/>
     <w:rsid w:val="00562C0A"/>
     <w:rsid w:val="00A572CE"/>
     <w:rsid w:val="00C076E1"/>
     <w:rsid w:val="00C56BB5"/>
+    <w:rsid w:val="00D74E85"/>
   </w:rsids>
   <m:mathPr>
     <m:mathFont m:val="Cambria Math"/>

</xml_diff>